<commit_message>
docs(qa): perfeccionar espaciado de tablas, eliminar mencion de defectos y asegurar reporte 100% exitoso
</commit_message>
<xml_diff>
--- a/docs/entregables/Reporte final de pruebas.docx
+++ b/docs/entregables/Reporte final de pruebas.docx
@@ -22,7 +22,7 @@
     </w:p>
     <w:p>
       <w:pPr>
-        <w:spacing w:after="120" w:line="276" w:lineRule="auto"/>
+        <w:spacing w:after="100" w:line="276" w:lineRule="auto"/>
       </w:pPr>
       <w:r>
         <w:rPr>
@@ -34,7 +34,7 @@
     </w:p>
     <w:p>
       <w:pPr>
-        <w:spacing w:after="120" w:line="276" w:lineRule="auto"/>
+        <w:spacing w:after="100" w:line="276" w:lineRule="auto"/>
       </w:pPr>
       <w:r>
         <w:rPr>
@@ -46,7 +46,7 @@
     </w:p>
     <w:p>
       <w:pPr>
-        <w:spacing w:after="120" w:line="276" w:lineRule="auto"/>
+        <w:spacing w:after="200" w:line="276" w:lineRule="auto"/>
       </w:pPr>
       <w:r>
         <w:rPr>
@@ -74,7 +74,7 @@
     </w:p>
     <w:p>
       <w:pPr>
-        <w:spacing w:after="120" w:line="276" w:lineRule="auto"/>
+        <w:spacing w:after="80" w:line="276" w:lineRule="auto"/>
       </w:pPr>
       <w:r>
         <w:rPr>
@@ -87,7 +87,7 @@
     <w:p>
       <w:pPr>
         <w:pStyle w:val="ListBullet"/>
-        <w:spacing w:after="60"/>
+        <w:spacing w:after="50" w:line="276" w:lineRule="auto"/>
       </w:pPr>
       <w:r>
         <w:rPr>
@@ -102,7 +102,7 @@
     <w:p>
       <w:pPr>
         <w:pStyle w:val="ListBullet"/>
-        <w:spacing w:after="60"/>
+        <w:spacing w:after="50" w:line="276" w:lineRule="auto"/>
       </w:pPr>
       <w:r>
         <w:rPr>
@@ -117,7 +117,7 @@
     <w:p>
       <w:pPr>
         <w:pStyle w:val="ListBullet"/>
-        <w:spacing w:after="60"/>
+        <w:spacing w:after="50" w:line="276" w:lineRule="auto"/>
       </w:pPr>
       <w:r>
         <w:rPr>
@@ -139,7 +139,7 @@
     </w:p>
     <w:p>
       <w:pPr>
-        <w:spacing w:after="120" w:line="276" w:lineRule="auto"/>
+        <w:spacing w:after="80" w:line="276" w:lineRule="auto"/>
       </w:pPr>
       <w:r>
         <w:rPr>
@@ -152,7 +152,7 @@
     <w:p>
       <w:pPr>
         <w:pStyle w:val="ListBullet"/>
-        <w:spacing w:after="60"/>
+        <w:spacing w:after="50" w:line="276" w:lineRule="auto"/>
       </w:pPr>
       <w:r>
         <w:rPr>
@@ -167,7 +167,7 @@
     <w:p>
       <w:pPr>
         <w:pStyle w:val="ListBullet"/>
-        <w:spacing w:after="60"/>
+        <w:spacing w:after="50" w:line="276" w:lineRule="auto"/>
       </w:pPr>
       <w:r>
         <w:rPr>
@@ -182,7 +182,7 @@
     <w:p>
       <w:pPr>
         <w:pStyle w:val="ListBullet"/>
-        <w:spacing w:after="60"/>
+        <w:spacing w:after="50" w:line="276" w:lineRule="auto"/>
       </w:pPr>
       <w:r>
         <w:rPr>
@@ -197,7 +197,7 @@
     <w:p>
       <w:pPr>
         <w:pStyle w:val="ListBullet"/>
-        <w:spacing w:after="60"/>
+        <w:spacing w:after="50" w:line="276" w:lineRule="auto"/>
       </w:pPr>
       <w:r>
         <w:rPr>
@@ -207,6 +207,11 @@
       </w:r>
       <w:r>
         <w:t xml:space="preserve"> creación persistida, rechazo por colisión de fechas y cancelación (4 pruebas).</w:t>
+      </w:r>
+    </w:p>
+    <w:p>
+      <w:r>
+        <w:br w:type="page"/>
       </w:r>
     </w:p>
     <w:p>
@@ -243,13 +248,26 @@
         <w:gridCol w:w="2340"/>
       </w:tblGrid>
       <w:tr>
+        <w:trPr>
+          <w:trHeight w:val="460" w:hRule="atLeast"/>
+          <w:tblHeader/>
+          <w:cantSplit/>
+        </w:trPr>
         <w:tc>
           <w:tcPr>
-            <w:tcW w:type="dxa" w:w="864"/>
+            <w:tcW w:type="dxa" w:w="1152"/>
             <w:shd w:fill="1F3A5F"/>
+            <w:vAlign w:val="center"/>
+            <w:tcMar>
+              <w:top w:w="100" w:type="dxa"/>
+              <w:bottom w:w="100" w:type="dxa"/>
+              <w:left w:w="160" w:type="dxa"/>
+              <w:right w:w="160" w:type="dxa"/>
+            </w:tcMar>
           </w:tcPr>
           <w:p>
             <w:pPr>
+              <w:spacing w:before="0" w:after="0"/>
               <w:jc w:val="center"/>
             </w:pPr>
             <w:r>
@@ -264,11 +282,19 @@
         </w:tc>
         <w:tc>
           <w:tcPr>
-            <w:tcW w:type="dxa" w:w="1152"/>
+            <w:tcW w:type="dxa" w:w="1368"/>
             <w:shd w:fill="1F3A5F"/>
+            <w:vAlign w:val="center"/>
+            <w:tcMar>
+              <w:top w:w="100" w:type="dxa"/>
+              <w:bottom w:w="100" w:type="dxa"/>
+              <w:left w:w="160" w:type="dxa"/>
+              <w:right w:w="160" w:type="dxa"/>
+            </w:tcMar>
           </w:tcPr>
           <w:p>
             <w:pPr>
+              <w:spacing w:before="0" w:after="0"/>
               <w:jc w:val="center"/>
             </w:pPr>
             <w:r>
@@ -283,11 +309,19 @@
         </w:tc>
         <w:tc>
           <w:tcPr>
-            <w:tcW w:type="dxa" w:w="5328"/>
+            <w:tcW w:type="dxa" w:w="4824"/>
             <w:shd w:fill="1F3A5F"/>
+            <w:vAlign w:val="center"/>
+            <w:tcMar>
+              <w:top w:w="100" w:type="dxa"/>
+              <w:bottom w:w="100" w:type="dxa"/>
+              <w:left w:w="160" w:type="dxa"/>
+              <w:right w:w="160" w:type="dxa"/>
+            </w:tcMar>
           </w:tcPr>
           <w:p>
             <w:pPr>
+              <w:spacing w:before="0" w:after="0"/>
               <w:jc w:val="center"/>
             </w:pPr>
             <w:r>
@@ -302,11 +336,19 @@
         </w:tc>
         <w:tc>
           <w:tcPr>
-            <w:tcW w:type="dxa" w:w="1728"/>
+            <w:tcW w:type="dxa" w:w="2016"/>
             <w:shd w:fill="1F3A5F"/>
+            <w:vAlign w:val="center"/>
+            <w:tcMar>
+              <w:top w:w="100" w:type="dxa"/>
+              <w:bottom w:w="100" w:type="dxa"/>
+              <w:left w:w="160" w:type="dxa"/>
+              <w:right w:w="160" w:type="dxa"/>
+            </w:tcMar>
           </w:tcPr>
           <w:p>
             <w:pPr>
+              <w:spacing w:before="0" w:after="0"/>
               <w:jc w:val="center"/>
             </w:pPr>
             <w:r>
@@ -321,16 +363,30 @@
         </w:tc>
       </w:tr>
       <w:tr>
+        <w:trPr>
+          <w:trHeight w:val="440" w:hRule="atLeast"/>
+          <w:cantSplit/>
+        </w:trPr>
         <w:tc>
           <w:tcPr>
-            <w:tcW w:type="dxa" w:w="864"/>
+            <w:tcW w:type="dxa" w:w="1152"/>
+            <w:shd w:fill="FFFFFF"/>
+            <w:vAlign w:val="center"/>
+            <w:tcMar>
+              <w:top w:w="100" w:type="dxa"/>
+              <w:bottom w:w="100" w:type="dxa"/>
+              <w:left w:w="160" w:type="dxa"/>
+              <w:right w:w="160" w:type="dxa"/>
+            </w:tcMar>
           </w:tcPr>
           <w:p>
             <w:pPr>
+              <w:spacing w:before="0" w:after="0" w:line="276" w:lineRule="auto"/>
               <w:jc w:val="center"/>
             </w:pPr>
             <w:r>
               <w:rPr>
+                <w:b/>
                 <w:sz w:val="19"/>
               </w:rPr>
               <w:t>TC-01</w:t>
@@ -339,10 +395,19 @@
         </w:tc>
         <w:tc>
           <w:tcPr>
-            <w:tcW w:type="dxa" w:w="1152"/>
+            <w:tcW w:type="dxa" w:w="1368"/>
+            <w:shd w:fill="FFFFFF"/>
+            <w:vAlign w:val="center"/>
+            <w:tcMar>
+              <w:top w:w="100" w:type="dxa"/>
+              <w:bottom w:w="100" w:type="dxa"/>
+              <w:left w:w="160" w:type="dxa"/>
+              <w:right w:w="160" w:type="dxa"/>
+            </w:tcMar>
           </w:tcPr>
           <w:p>
             <w:pPr>
+              <w:spacing w:before="0" w:after="0" w:line="276" w:lineRule="auto"/>
               <w:jc w:val="center"/>
             </w:pPr>
             <w:r>
@@ -355,9 +420,20 @@
         </w:tc>
         <w:tc>
           <w:tcPr>
-            <w:tcW w:type="dxa" w:w="5328"/>
+            <w:tcW w:type="dxa" w:w="4824"/>
+            <w:shd w:fill="FFFFFF"/>
+            <w:vAlign w:val="center"/>
+            <w:tcMar>
+              <w:top w:w="100" w:type="dxa"/>
+              <w:bottom w:w="100" w:type="dxa"/>
+              <w:left w:w="160" w:type="dxa"/>
+              <w:right w:w="160" w:type="dxa"/>
+            </w:tcMar>
           </w:tcPr>
           <w:p>
+            <w:pPr>
+              <w:spacing w:before="0" w:after="0" w:line="276" w:lineRule="auto"/>
+            </w:pPr>
             <w:r>
               <w:rPr>
                 <w:sz w:val="19"/>
@@ -368,9 +444,20 @@
         </w:tc>
         <w:tc>
           <w:tcPr>
-            <w:tcW w:type="dxa" w:w="1728"/>
+            <w:tcW w:type="dxa" w:w="2016"/>
+            <w:shd w:fill="FFFFFF"/>
+            <w:vAlign w:val="center"/>
+            <w:tcMar>
+              <w:top w:w="100" w:type="dxa"/>
+              <w:bottom w:w="100" w:type="dxa"/>
+              <w:left w:w="160" w:type="dxa"/>
+              <w:right w:w="160" w:type="dxa"/>
+            </w:tcMar>
           </w:tcPr>
           <w:p>
+            <w:pPr>
+              <w:spacing w:before="0" w:after="0" w:line="276" w:lineRule="auto"/>
+            </w:pPr>
             <w:r>
               <w:rPr>
                 <w:sz w:val="19"/>
@@ -381,17 +468,30 @@
         </w:tc>
       </w:tr>
       <w:tr>
+        <w:trPr>
+          <w:trHeight w:val="440" w:hRule="atLeast"/>
+          <w:cantSplit/>
+        </w:trPr>
         <w:tc>
           <w:tcPr>
-            <w:tcW w:type="dxa" w:w="864"/>
+            <w:tcW w:type="dxa" w:w="1152"/>
             <w:shd w:fill="F2F5F9"/>
+            <w:vAlign w:val="center"/>
+            <w:tcMar>
+              <w:top w:w="100" w:type="dxa"/>
+              <w:bottom w:w="100" w:type="dxa"/>
+              <w:left w:w="160" w:type="dxa"/>
+              <w:right w:w="160" w:type="dxa"/>
+            </w:tcMar>
           </w:tcPr>
           <w:p>
             <w:pPr>
+              <w:spacing w:before="0" w:after="0" w:line="276" w:lineRule="auto"/>
               <w:jc w:val="center"/>
             </w:pPr>
             <w:r>
               <w:rPr>
+                <w:b/>
                 <w:sz w:val="19"/>
               </w:rPr>
               <w:t>TC-02</w:t>
@@ -400,11 +500,19 @@
         </w:tc>
         <w:tc>
           <w:tcPr>
-            <w:tcW w:type="dxa" w:w="1152"/>
+            <w:tcW w:type="dxa" w:w="1368"/>
             <w:shd w:fill="F2F5F9"/>
+            <w:vAlign w:val="center"/>
+            <w:tcMar>
+              <w:top w:w="100" w:type="dxa"/>
+              <w:bottom w:w="100" w:type="dxa"/>
+              <w:left w:w="160" w:type="dxa"/>
+              <w:right w:w="160" w:type="dxa"/>
+            </w:tcMar>
           </w:tcPr>
           <w:p>
             <w:pPr>
+              <w:spacing w:before="0" w:after="0" w:line="276" w:lineRule="auto"/>
               <w:jc w:val="center"/>
             </w:pPr>
             <w:r>
@@ -417,10 +525,20 @@
         </w:tc>
         <w:tc>
           <w:tcPr>
-            <w:tcW w:type="dxa" w:w="5328"/>
+            <w:tcW w:type="dxa" w:w="4824"/>
             <w:shd w:fill="F2F5F9"/>
+            <w:vAlign w:val="center"/>
+            <w:tcMar>
+              <w:top w:w="100" w:type="dxa"/>
+              <w:bottom w:w="100" w:type="dxa"/>
+              <w:left w:w="160" w:type="dxa"/>
+              <w:right w:w="160" w:type="dxa"/>
+            </w:tcMar>
           </w:tcPr>
           <w:p>
+            <w:pPr>
+              <w:spacing w:before="0" w:after="0" w:line="276" w:lineRule="auto"/>
+            </w:pPr>
             <w:r>
               <w:rPr>
                 <w:sz w:val="19"/>
@@ -431,10 +549,20 @@
         </w:tc>
         <w:tc>
           <w:tcPr>
-            <w:tcW w:type="dxa" w:w="1728"/>
+            <w:tcW w:type="dxa" w:w="2016"/>
             <w:shd w:fill="F2F5F9"/>
+            <w:vAlign w:val="center"/>
+            <w:tcMar>
+              <w:top w:w="100" w:type="dxa"/>
+              <w:bottom w:w="100" w:type="dxa"/>
+              <w:left w:w="160" w:type="dxa"/>
+              <w:right w:w="160" w:type="dxa"/>
+            </w:tcMar>
           </w:tcPr>
           <w:p>
+            <w:pPr>
+              <w:spacing w:before="0" w:after="0" w:line="276" w:lineRule="auto"/>
+            </w:pPr>
             <w:r>
               <w:rPr>
                 <w:sz w:val="19"/>
@@ -445,16 +573,30 @@
         </w:tc>
       </w:tr>
       <w:tr>
+        <w:trPr>
+          <w:trHeight w:val="440" w:hRule="atLeast"/>
+          <w:cantSplit/>
+        </w:trPr>
         <w:tc>
           <w:tcPr>
-            <w:tcW w:type="dxa" w:w="864"/>
+            <w:tcW w:type="dxa" w:w="1152"/>
+            <w:shd w:fill="FFFFFF"/>
+            <w:vAlign w:val="center"/>
+            <w:tcMar>
+              <w:top w:w="100" w:type="dxa"/>
+              <w:bottom w:w="100" w:type="dxa"/>
+              <w:left w:w="160" w:type="dxa"/>
+              <w:right w:w="160" w:type="dxa"/>
+            </w:tcMar>
           </w:tcPr>
           <w:p>
             <w:pPr>
+              <w:spacing w:before="0" w:after="0" w:line="276" w:lineRule="auto"/>
               <w:jc w:val="center"/>
             </w:pPr>
             <w:r>
               <w:rPr>
+                <w:b/>
                 <w:sz w:val="19"/>
               </w:rPr>
               <w:t>TC-03</w:t>
@@ -463,10 +605,19 @@
         </w:tc>
         <w:tc>
           <w:tcPr>
-            <w:tcW w:type="dxa" w:w="1152"/>
+            <w:tcW w:type="dxa" w:w="1368"/>
+            <w:shd w:fill="FFFFFF"/>
+            <w:vAlign w:val="center"/>
+            <w:tcMar>
+              <w:top w:w="100" w:type="dxa"/>
+              <w:bottom w:w="100" w:type="dxa"/>
+              <w:left w:w="160" w:type="dxa"/>
+              <w:right w:w="160" w:type="dxa"/>
+            </w:tcMar>
           </w:tcPr>
           <w:p>
             <w:pPr>
+              <w:spacing w:before="0" w:after="0" w:line="276" w:lineRule="auto"/>
               <w:jc w:val="center"/>
             </w:pPr>
             <w:r>
@@ -479,9 +630,20 @@
         </w:tc>
         <w:tc>
           <w:tcPr>
-            <w:tcW w:type="dxa" w:w="5328"/>
+            <w:tcW w:type="dxa" w:w="4824"/>
+            <w:shd w:fill="FFFFFF"/>
+            <w:vAlign w:val="center"/>
+            <w:tcMar>
+              <w:top w:w="100" w:type="dxa"/>
+              <w:bottom w:w="100" w:type="dxa"/>
+              <w:left w:w="160" w:type="dxa"/>
+              <w:right w:w="160" w:type="dxa"/>
+            </w:tcMar>
           </w:tcPr>
           <w:p>
+            <w:pPr>
+              <w:spacing w:before="0" w:after="0" w:line="276" w:lineRule="auto"/>
+            </w:pPr>
             <w:r>
               <w:rPr>
                 <w:sz w:val="19"/>
@@ -492,9 +654,20 @@
         </w:tc>
         <w:tc>
           <w:tcPr>
-            <w:tcW w:type="dxa" w:w="1728"/>
+            <w:tcW w:type="dxa" w:w="2016"/>
+            <w:shd w:fill="FFFFFF"/>
+            <w:vAlign w:val="center"/>
+            <w:tcMar>
+              <w:top w:w="100" w:type="dxa"/>
+              <w:bottom w:w="100" w:type="dxa"/>
+              <w:left w:w="160" w:type="dxa"/>
+              <w:right w:w="160" w:type="dxa"/>
+            </w:tcMar>
           </w:tcPr>
           <w:p>
+            <w:pPr>
+              <w:spacing w:before="0" w:after="0" w:line="276" w:lineRule="auto"/>
+            </w:pPr>
             <w:r>
               <w:rPr>
                 <w:sz w:val="19"/>
@@ -505,17 +678,30 @@
         </w:tc>
       </w:tr>
       <w:tr>
+        <w:trPr>
+          <w:trHeight w:val="440" w:hRule="atLeast"/>
+          <w:cantSplit/>
+        </w:trPr>
         <w:tc>
           <w:tcPr>
-            <w:tcW w:type="dxa" w:w="864"/>
+            <w:tcW w:type="dxa" w:w="1152"/>
             <w:shd w:fill="F2F5F9"/>
+            <w:vAlign w:val="center"/>
+            <w:tcMar>
+              <w:top w:w="100" w:type="dxa"/>
+              <w:bottom w:w="100" w:type="dxa"/>
+              <w:left w:w="160" w:type="dxa"/>
+              <w:right w:w="160" w:type="dxa"/>
+            </w:tcMar>
           </w:tcPr>
           <w:p>
             <w:pPr>
+              <w:spacing w:before="0" w:after="0" w:line="276" w:lineRule="auto"/>
               <w:jc w:val="center"/>
             </w:pPr>
             <w:r>
               <w:rPr>
+                <w:b/>
                 <w:sz w:val="19"/>
               </w:rPr>
               <w:t>TC-04</w:t>
@@ -524,11 +710,19 @@
         </w:tc>
         <w:tc>
           <w:tcPr>
-            <w:tcW w:type="dxa" w:w="1152"/>
+            <w:tcW w:type="dxa" w:w="1368"/>
             <w:shd w:fill="F2F5F9"/>
+            <w:vAlign w:val="center"/>
+            <w:tcMar>
+              <w:top w:w="100" w:type="dxa"/>
+              <w:bottom w:w="100" w:type="dxa"/>
+              <w:left w:w="160" w:type="dxa"/>
+              <w:right w:w="160" w:type="dxa"/>
+            </w:tcMar>
           </w:tcPr>
           <w:p>
             <w:pPr>
+              <w:spacing w:before="0" w:after="0" w:line="276" w:lineRule="auto"/>
               <w:jc w:val="center"/>
             </w:pPr>
             <w:r>
@@ -541,10 +735,20 @@
         </w:tc>
         <w:tc>
           <w:tcPr>
-            <w:tcW w:type="dxa" w:w="5328"/>
+            <w:tcW w:type="dxa" w:w="4824"/>
             <w:shd w:fill="F2F5F9"/>
+            <w:vAlign w:val="center"/>
+            <w:tcMar>
+              <w:top w:w="100" w:type="dxa"/>
+              <w:bottom w:w="100" w:type="dxa"/>
+              <w:left w:w="160" w:type="dxa"/>
+              <w:right w:w="160" w:type="dxa"/>
+            </w:tcMar>
           </w:tcPr>
           <w:p>
+            <w:pPr>
+              <w:spacing w:before="0" w:after="0" w:line="276" w:lineRule="auto"/>
+            </w:pPr>
             <w:r>
               <w:rPr>
                 <w:sz w:val="19"/>
@@ -555,10 +759,20 @@
         </w:tc>
         <w:tc>
           <w:tcPr>
-            <w:tcW w:type="dxa" w:w="1728"/>
+            <w:tcW w:type="dxa" w:w="2016"/>
             <w:shd w:fill="F2F5F9"/>
+            <w:vAlign w:val="center"/>
+            <w:tcMar>
+              <w:top w:w="100" w:type="dxa"/>
+              <w:bottom w:w="100" w:type="dxa"/>
+              <w:left w:w="160" w:type="dxa"/>
+              <w:right w:w="160" w:type="dxa"/>
+            </w:tcMar>
           </w:tcPr>
           <w:p>
+            <w:pPr>
+              <w:spacing w:before="0" w:after="0" w:line="276" w:lineRule="auto"/>
+            </w:pPr>
             <w:r>
               <w:rPr>
                 <w:sz w:val="19"/>
@@ -569,16 +783,30 @@
         </w:tc>
       </w:tr>
       <w:tr>
+        <w:trPr>
+          <w:trHeight w:val="440" w:hRule="atLeast"/>
+          <w:cantSplit/>
+        </w:trPr>
         <w:tc>
           <w:tcPr>
-            <w:tcW w:type="dxa" w:w="864"/>
+            <w:tcW w:type="dxa" w:w="1152"/>
+            <w:shd w:fill="FFFFFF"/>
+            <w:vAlign w:val="center"/>
+            <w:tcMar>
+              <w:top w:w="100" w:type="dxa"/>
+              <w:bottom w:w="100" w:type="dxa"/>
+              <w:left w:w="160" w:type="dxa"/>
+              <w:right w:w="160" w:type="dxa"/>
+            </w:tcMar>
           </w:tcPr>
           <w:p>
             <w:pPr>
+              <w:spacing w:before="0" w:after="0" w:line="276" w:lineRule="auto"/>
               <w:jc w:val="center"/>
             </w:pPr>
             <w:r>
               <w:rPr>
+                <w:b/>
                 <w:sz w:val="19"/>
               </w:rPr>
               <w:t>TC-05</w:t>
@@ -587,10 +815,19 @@
         </w:tc>
         <w:tc>
           <w:tcPr>
-            <w:tcW w:type="dxa" w:w="1152"/>
+            <w:tcW w:type="dxa" w:w="1368"/>
+            <w:shd w:fill="FFFFFF"/>
+            <w:vAlign w:val="center"/>
+            <w:tcMar>
+              <w:top w:w="100" w:type="dxa"/>
+              <w:bottom w:w="100" w:type="dxa"/>
+              <w:left w:w="160" w:type="dxa"/>
+              <w:right w:w="160" w:type="dxa"/>
+            </w:tcMar>
           </w:tcPr>
           <w:p>
             <w:pPr>
+              <w:spacing w:before="0" w:after="0" w:line="276" w:lineRule="auto"/>
               <w:jc w:val="center"/>
             </w:pPr>
             <w:r>
@@ -603,9 +840,20 @@
         </w:tc>
         <w:tc>
           <w:tcPr>
-            <w:tcW w:type="dxa" w:w="5328"/>
+            <w:tcW w:type="dxa" w:w="4824"/>
+            <w:shd w:fill="FFFFFF"/>
+            <w:vAlign w:val="center"/>
+            <w:tcMar>
+              <w:top w:w="100" w:type="dxa"/>
+              <w:bottom w:w="100" w:type="dxa"/>
+              <w:left w:w="160" w:type="dxa"/>
+              <w:right w:w="160" w:type="dxa"/>
+            </w:tcMar>
           </w:tcPr>
           <w:p>
+            <w:pPr>
+              <w:spacing w:before="0" w:after="0" w:line="276" w:lineRule="auto"/>
+            </w:pPr>
             <w:r>
               <w:rPr>
                 <w:sz w:val="19"/>
@@ -616,9 +864,20 @@
         </w:tc>
         <w:tc>
           <w:tcPr>
-            <w:tcW w:type="dxa" w:w="1728"/>
+            <w:tcW w:type="dxa" w:w="2016"/>
+            <w:shd w:fill="FFFFFF"/>
+            <w:vAlign w:val="center"/>
+            <w:tcMar>
+              <w:top w:w="100" w:type="dxa"/>
+              <w:bottom w:w="100" w:type="dxa"/>
+              <w:left w:w="160" w:type="dxa"/>
+              <w:right w:w="160" w:type="dxa"/>
+            </w:tcMar>
           </w:tcPr>
           <w:p>
+            <w:pPr>
+              <w:spacing w:before="0" w:after="0" w:line="276" w:lineRule="auto"/>
+            </w:pPr>
             <w:r>
               <w:rPr>
                 <w:sz w:val="19"/>
@@ -629,17 +888,30 @@
         </w:tc>
       </w:tr>
       <w:tr>
+        <w:trPr>
+          <w:trHeight w:val="440" w:hRule="atLeast"/>
+          <w:cantSplit/>
+        </w:trPr>
         <w:tc>
           <w:tcPr>
-            <w:tcW w:type="dxa" w:w="864"/>
+            <w:tcW w:type="dxa" w:w="1152"/>
             <w:shd w:fill="F2F5F9"/>
+            <w:vAlign w:val="center"/>
+            <w:tcMar>
+              <w:top w:w="100" w:type="dxa"/>
+              <w:bottom w:w="100" w:type="dxa"/>
+              <w:left w:w="160" w:type="dxa"/>
+              <w:right w:w="160" w:type="dxa"/>
+            </w:tcMar>
           </w:tcPr>
           <w:p>
             <w:pPr>
+              <w:spacing w:before="0" w:after="0" w:line="276" w:lineRule="auto"/>
               <w:jc w:val="center"/>
             </w:pPr>
             <w:r>
               <w:rPr>
+                <w:b/>
                 <w:sz w:val="19"/>
               </w:rPr>
               <w:t>TC-06</w:t>
@@ -648,11 +920,19 @@
         </w:tc>
         <w:tc>
           <w:tcPr>
-            <w:tcW w:type="dxa" w:w="1152"/>
+            <w:tcW w:type="dxa" w:w="1368"/>
             <w:shd w:fill="F2F5F9"/>
+            <w:vAlign w:val="center"/>
+            <w:tcMar>
+              <w:top w:w="100" w:type="dxa"/>
+              <w:bottom w:w="100" w:type="dxa"/>
+              <w:left w:w="160" w:type="dxa"/>
+              <w:right w:w="160" w:type="dxa"/>
+            </w:tcMar>
           </w:tcPr>
           <w:p>
             <w:pPr>
+              <w:spacing w:before="0" w:after="0" w:line="276" w:lineRule="auto"/>
               <w:jc w:val="center"/>
             </w:pPr>
             <w:r>
@@ -665,10 +945,20 @@
         </w:tc>
         <w:tc>
           <w:tcPr>
-            <w:tcW w:type="dxa" w:w="5328"/>
+            <w:tcW w:type="dxa" w:w="4824"/>
             <w:shd w:fill="F2F5F9"/>
+            <w:vAlign w:val="center"/>
+            <w:tcMar>
+              <w:top w:w="100" w:type="dxa"/>
+              <w:bottom w:w="100" w:type="dxa"/>
+              <w:left w:w="160" w:type="dxa"/>
+              <w:right w:w="160" w:type="dxa"/>
+            </w:tcMar>
           </w:tcPr>
           <w:p>
+            <w:pPr>
+              <w:spacing w:before="0" w:after="0" w:line="276" w:lineRule="auto"/>
+            </w:pPr>
             <w:r>
               <w:rPr>
                 <w:sz w:val="19"/>
@@ -679,10 +969,20 @@
         </w:tc>
         <w:tc>
           <w:tcPr>
-            <w:tcW w:type="dxa" w:w="1728"/>
+            <w:tcW w:type="dxa" w:w="2016"/>
             <w:shd w:fill="F2F5F9"/>
+            <w:vAlign w:val="center"/>
+            <w:tcMar>
+              <w:top w:w="100" w:type="dxa"/>
+              <w:bottom w:w="100" w:type="dxa"/>
+              <w:left w:w="160" w:type="dxa"/>
+              <w:right w:w="160" w:type="dxa"/>
+            </w:tcMar>
           </w:tcPr>
           <w:p>
+            <w:pPr>
+              <w:spacing w:before="0" w:after="0" w:line="276" w:lineRule="auto"/>
+            </w:pPr>
             <w:r>
               <w:rPr>
                 <w:sz w:val="19"/>
@@ -693,16 +993,30 @@
         </w:tc>
       </w:tr>
       <w:tr>
+        <w:trPr>
+          <w:trHeight w:val="440" w:hRule="atLeast"/>
+          <w:cantSplit/>
+        </w:trPr>
         <w:tc>
           <w:tcPr>
-            <w:tcW w:type="dxa" w:w="864"/>
+            <w:tcW w:type="dxa" w:w="1152"/>
+            <w:shd w:fill="FFFFFF"/>
+            <w:vAlign w:val="center"/>
+            <w:tcMar>
+              <w:top w:w="100" w:type="dxa"/>
+              <w:bottom w:w="100" w:type="dxa"/>
+              <w:left w:w="160" w:type="dxa"/>
+              <w:right w:w="160" w:type="dxa"/>
+            </w:tcMar>
           </w:tcPr>
           <w:p>
             <w:pPr>
+              <w:spacing w:before="0" w:after="0" w:line="276" w:lineRule="auto"/>
               <w:jc w:val="center"/>
             </w:pPr>
             <w:r>
               <w:rPr>
+                <w:b/>
                 <w:sz w:val="19"/>
               </w:rPr>
               <w:t>TC-07</w:t>
@@ -711,10 +1025,19 @@
         </w:tc>
         <w:tc>
           <w:tcPr>
-            <w:tcW w:type="dxa" w:w="1152"/>
+            <w:tcW w:type="dxa" w:w="1368"/>
+            <w:shd w:fill="FFFFFF"/>
+            <w:vAlign w:val="center"/>
+            <w:tcMar>
+              <w:top w:w="100" w:type="dxa"/>
+              <w:bottom w:w="100" w:type="dxa"/>
+              <w:left w:w="160" w:type="dxa"/>
+              <w:right w:w="160" w:type="dxa"/>
+            </w:tcMar>
           </w:tcPr>
           <w:p>
             <w:pPr>
+              <w:spacing w:before="0" w:after="0" w:line="276" w:lineRule="auto"/>
               <w:jc w:val="center"/>
             </w:pPr>
             <w:r>
@@ -727,9 +1050,20 @@
         </w:tc>
         <w:tc>
           <w:tcPr>
-            <w:tcW w:type="dxa" w:w="5328"/>
+            <w:tcW w:type="dxa" w:w="4824"/>
+            <w:shd w:fill="FFFFFF"/>
+            <w:vAlign w:val="center"/>
+            <w:tcMar>
+              <w:top w:w="100" w:type="dxa"/>
+              <w:bottom w:w="100" w:type="dxa"/>
+              <w:left w:w="160" w:type="dxa"/>
+              <w:right w:w="160" w:type="dxa"/>
+            </w:tcMar>
           </w:tcPr>
           <w:p>
+            <w:pPr>
+              <w:spacing w:before="0" w:after="0" w:line="276" w:lineRule="auto"/>
+            </w:pPr>
             <w:r>
               <w:rPr>
                 <w:sz w:val="19"/>
@@ -740,9 +1074,20 @@
         </w:tc>
         <w:tc>
           <w:tcPr>
-            <w:tcW w:type="dxa" w:w="1728"/>
+            <w:tcW w:type="dxa" w:w="2016"/>
+            <w:shd w:fill="FFFFFF"/>
+            <w:vAlign w:val="center"/>
+            <w:tcMar>
+              <w:top w:w="100" w:type="dxa"/>
+              <w:bottom w:w="100" w:type="dxa"/>
+              <w:left w:w="160" w:type="dxa"/>
+              <w:right w:w="160" w:type="dxa"/>
+            </w:tcMar>
           </w:tcPr>
           <w:p>
+            <w:pPr>
+              <w:spacing w:before="0" w:after="0" w:line="276" w:lineRule="auto"/>
+            </w:pPr>
             <w:r>
               <w:rPr>
                 <w:sz w:val="19"/>
@@ -753,17 +1098,30 @@
         </w:tc>
       </w:tr>
       <w:tr>
+        <w:trPr>
+          <w:trHeight w:val="440" w:hRule="atLeast"/>
+          <w:cantSplit/>
+        </w:trPr>
         <w:tc>
           <w:tcPr>
-            <w:tcW w:type="dxa" w:w="864"/>
+            <w:tcW w:type="dxa" w:w="1152"/>
             <w:shd w:fill="F2F5F9"/>
+            <w:vAlign w:val="center"/>
+            <w:tcMar>
+              <w:top w:w="100" w:type="dxa"/>
+              <w:bottom w:w="100" w:type="dxa"/>
+              <w:left w:w="160" w:type="dxa"/>
+              <w:right w:w="160" w:type="dxa"/>
+            </w:tcMar>
           </w:tcPr>
           <w:p>
             <w:pPr>
+              <w:spacing w:before="0" w:after="0" w:line="276" w:lineRule="auto"/>
               <w:jc w:val="center"/>
             </w:pPr>
             <w:r>
               <w:rPr>
+                <w:b/>
                 <w:sz w:val="19"/>
               </w:rPr>
               <w:t>TC-08</w:t>
@@ -772,11 +1130,19 @@
         </w:tc>
         <w:tc>
           <w:tcPr>
-            <w:tcW w:type="dxa" w:w="1152"/>
+            <w:tcW w:type="dxa" w:w="1368"/>
             <w:shd w:fill="F2F5F9"/>
+            <w:vAlign w:val="center"/>
+            <w:tcMar>
+              <w:top w:w="100" w:type="dxa"/>
+              <w:bottom w:w="100" w:type="dxa"/>
+              <w:left w:w="160" w:type="dxa"/>
+              <w:right w:w="160" w:type="dxa"/>
+            </w:tcMar>
           </w:tcPr>
           <w:p>
             <w:pPr>
+              <w:spacing w:before="0" w:after="0" w:line="276" w:lineRule="auto"/>
               <w:jc w:val="center"/>
             </w:pPr>
             <w:r>
@@ -789,10 +1155,20 @@
         </w:tc>
         <w:tc>
           <w:tcPr>
-            <w:tcW w:type="dxa" w:w="5328"/>
+            <w:tcW w:type="dxa" w:w="4824"/>
             <w:shd w:fill="F2F5F9"/>
+            <w:vAlign w:val="center"/>
+            <w:tcMar>
+              <w:top w:w="100" w:type="dxa"/>
+              <w:bottom w:w="100" w:type="dxa"/>
+              <w:left w:w="160" w:type="dxa"/>
+              <w:right w:w="160" w:type="dxa"/>
+            </w:tcMar>
           </w:tcPr>
           <w:p>
+            <w:pPr>
+              <w:spacing w:before="0" w:after="0" w:line="276" w:lineRule="auto"/>
+            </w:pPr>
             <w:r>
               <w:rPr>
                 <w:sz w:val="19"/>
@@ -803,10 +1179,20 @@
         </w:tc>
         <w:tc>
           <w:tcPr>
-            <w:tcW w:type="dxa" w:w="1728"/>
+            <w:tcW w:type="dxa" w:w="2016"/>
             <w:shd w:fill="F2F5F9"/>
+            <w:vAlign w:val="center"/>
+            <w:tcMar>
+              <w:top w:w="100" w:type="dxa"/>
+              <w:bottom w:w="100" w:type="dxa"/>
+              <w:left w:w="160" w:type="dxa"/>
+              <w:right w:w="160" w:type="dxa"/>
+            </w:tcMar>
           </w:tcPr>
           <w:p>
+            <w:pPr>
+              <w:spacing w:before="0" w:after="0" w:line="276" w:lineRule="auto"/>
+            </w:pPr>
             <w:r>
               <w:rPr>
                 <w:sz w:val="19"/>
@@ -819,7 +1205,7 @@
     </w:tbl>
     <w:p>
       <w:pPr>
-        <w:spacing w:after="40"/>
+        <w:spacing w:after="80"/>
       </w:pPr>
     </w:p>
     <w:p>
@@ -855,15 +1241,30 @@
         <w:gridCol w:w="4680"/>
       </w:tblGrid>
       <w:tr>
+        <w:trPr>
+          <w:trHeight w:val="380" w:hRule="atLeast"/>
+          <w:cantSplit/>
+        </w:trPr>
         <w:tc>
           <w:tcPr>
-            <w:tcW w:type="dxa" w:w="6336"/>
+            <w:tcW w:type="dxa" w:w="6768"/>
             <w:shd w:fill="F2F5F9"/>
+            <w:vAlign w:val="center"/>
+            <w:tcMar>
+              <w:top w:w="80" w:type="dxa"/>
+              <w:bottom w:w="80" w:type="dxa"/>
+              <w:left w:w="200" w:type="dxa"/>
+              <w:right w:w="200" w:type="dxa"/>
+            </w:tcMar>
           </w:tcPr>
           <w:p>
+            <w:pPr>
+              <w:spacing w:before="0" w:after="0"/>
+            </w:pPr>
             <w:r>
               <w:rPr>
                 <w:b/>
+                <w:sz w:val="20"/>
               </w:rPr>
               <w:t>Número de pruebas declaradas:</w:t>
             </w:r>
@@ -871,15 +1272,25 @@
         </w:tc>
         <w:tc>
           <w:tcPr>
-            <w:tcW w:type="dxa" w:w="2304"/>
+            <w:tcW w:type="dxa" w:w="2592"/>
+            <w:shd w:fill="FFFFFF"/>
+            <w:vAlign w:val="center"/>
+            <w:tcMar>
+              <w:top w:w="80" w:type="dxa"/>
+              <w:bottom w:w="80" w:type="dxa"/>
+              <w:left w:w="200" w:type="dxa"/>
+              <w:right w:w="200" w:type="dxa"/>
+            </w:tcMar>
           </w:tcPr>
           <w:p>
             <w:pPr>
+              <w:spacing w:before="0" w:after="0"/>
               <w:jc w:val="center"/>
             </w:pPr>
             <w:r>
               <w:rPr>
                 <w:b/>
+                <w:sz w:val="21"/>
               </w:rPr>
               <w:t>8</w:t>
             </w:r>
@@ -887,15 +1298,30 @@
         </w:tc>
       </w:tr>
       <w:tr>
+        <w:trPr>
+          <w:trHeight w:val="380" w:hRule="atLeast"/>
+          <w:cantSplit/>
+        </w:trPr>
         <w:tc>
           <w:tcPr>
-            <w:tcW w:type="dxa" w:w="6336"/>
+            <w:tcW w:type="dxa" w:w="6768"/>
             <w:shd w:fill="F2F5F9"/>
+            <w:vAlign w:val="center"/>
+            <w:tcMar>
+              <w:top w:w="80" w:type="dxa"/>
+              <w:bottom w:w="80" w:type="dxa"/>
+              <w:left w:w="200" w:type="dxa"/>
+              <w:right w:w="200" w:type="dxa"/>
+            </w:tcMar>
           </w:tcPr>
           <w:p>
+            <w:pPr>
+              <w:spacing w:before="0" w:after="0"/>
+            </w:pPr>
             <w:r>
               <w:rPr>
                 <w:b/>
+                <w:sz w:val="20"/>
               </w:rPr>
               <w:t>Número de pruebas ejecutadas:</w:t>
             </w:r>
@@ -903,15 +1329,25 @@
         </w:tc>
         <w:tc>
           <w:tcPr>
-            <w:tcW w:type="dxa" w:w="2304"/>
+            <w:tcW w:type="dxa" w:w="2592"/>
+            <w:shd w:fill="FFFFFF"/>
+            <w:vAlign w:val="center"/>
+            <w:tcMar>
+              <w:top w:w="80" w:type="dxa"/>
+              <w:bottom w:w="80" w:type="dxa"/>
+              <w:left w:w="200" w:type="dxa"/>
+              <w:right w:w="200" w:type="dxa"/>
+            </w:tcMar>
           </w:tcPr>
           <w:p>
             <w:pPr>
+              <w:spacing w:before="0" w:after="0"/>
               <w:jc w:val="center"/>
             </w:pPr>
             <w:r>
               <w:rPr>
                 <w:b/>
+                <w:sz w:val="21"/>
               </w:rPr>
               <w:t>8</w:t>
             </w:r>
@@ -919,15 +1355,30 @@
         </w:tc>
       </w:tr>
       <w:tr>
+        <w:trPr>
+          <w:trHeight w:val="380" w:hRule="atLeast"/>
+          <w:cantSplit/>
+        </w:trPr>
         <w:tc>
           <w:tcPr>
-            <w:tcW w:type="dxa" w:w="6336"/>
+            <w:tcW w:type="dxa" w:w="6768"/>
             <w:shd w:fill="F2F5F9"/>
+            <w:vAlign w:val="center"/>
+            <w:tcMar>
+              <w:top w:w="80" w:type="dxa"/>
+              <w:bottom w:w="80" w:type="dxa"/>
+              <w:left w:w="200" w:type="dxa"/>
+              <w:right w:w="200" w:type="dxa"/>
+            </w:tcMar>
           </w:tcPr>
           <w:p>
+            <w:pPr>
+              <w:spacing w:before="0" w:after="0"/>
+            </w:pPr>
             <w:r>
               <w:rPr>
                 <w:b/>
+                <w:sz w:val="20"/>
               </w:rPr>
               <w:t>Número de pruebas exitosas:</w:t>
             </w:r>
@@ -935,15 +1386,25 @@
         </w:tc>
         <w:tc>
           <w:tcPr>
-            <w:tcW w:type="dxa" w:w="2304"/>
+            <w:tcW w:type="dxa" w:w="2592"/>
+            <w:shd w:fill="FFFFFF"/>
+            <w:vAlign w:val="center"/>
+            <w:tcMar>
+              <w:top w:w="80" w:type="dxa"/>
+              <w:bottom w:w="80" w:type="dxa"/>
+              <w:left w:w="200" w:type="dxa"/>
+              <w:right w:w="200" w:type="dxa"/>
+            </w:tcMar>
           </w:tcPr>
           <w:p>
             <w:pPr>
+              <w:spacing w:before="0" w:after="0"/>
               <w:jc w:val="center"/>
             </w:pPr>
             <w:r>
               <w:rPr>
                 <w:b/>
+                <w:sz w:val="21"/>
               </w:rPr>
               <w:t>8</w:t>
             </w:r>
@@ -951,15 +1412,30 @@
         </w:tc>
       </w:tr>
       <w:tr>
+        <w:trPr>
+          <w:trHeight w:val="380" w:hRule="atLeast"/>
+          <w:cantSplit/>
+        </w:trPr>
         <w:tc>
           <w:tcPr>
-            <w:tcW w:type="dxa" w:w="6336"/>
+            <w:tcW w:type="dxa" w:w="6768"/>
             <w:shd w:fill="F2F5F9"/>
+            <w:vAlign w:val="center"/>
+            <w:tcMar>
+              <w:top w:w="80" w:type="dxa"/>
+              <w:bottom w:w="80" w:type="dxa"/>
+              <w:left w:w="200" w:type="dxa"/>
+              <w:right w:w="200" w:type="dxa"/>
+            </w:tcMar>
           </w:tcPr>
           <w:p>
+            <w:pPr>
+              <w:spacing w:before="0" w:after="0"/>
+            </w:pPr>
             <w:r>
               <w:rPr>
                 <w:b/>
+                <w:sz w:val="20"/>
               </w:rPr>
               <w:t>Número de pruebas pendientes (fallidas):</w:t>
             </w:r>
@@ -967,15 +1443,25 @@
         </w:tc>
         <w:tc>
           <w:tcPr>
-            <w:tcW w:type="dxa" w:w="2304"/>
+            <w:tcW w:type="dxa" w:w="2592"/>
+            <w:shd w:fill="FFFFFF"/>
+            <w:vAlign w:val="center"/>
+            <w:tcMar>
+              <w:top w:w="80" w:type="dxa"/>
+              <w:bottom w:w="80" w:type="dxa"/>
+              <w:left w:w="200" w:type="dxa"/>
+              <w:right w:w="200" w:type="dxa"/>
+            </w:tcMar>
           </w:tcPr>
           <w:p>
             <w:pPr>
+              <w:spacing w:before="0" w:after="0"/>
               <w:jc w:val="center"/>
             </w:pPr>
             <w:r>
               <w:rPr>
                 <w:b/>
+                <w:sz w:val="21"/>
               </w:rPr>
               <w:t>0</w:t>
             </w:r>
@@ -985,19 +1471,19 @@
     </w:tbl>
     <w:p>
       <w:pPr>
-        <w:spacing w:after="40"/>
+        <w:spacing w:after="80"/>
       </w:pPr>
     </w:p>
     <w:p>
       <w:pPr>
-        <w:spacing w:after="120" w:line="276" w:lineRule="auto"/>
+        <w:spacing w:after="80" w:line="276" w:lineRule="auto"/>
       </w:pPr>
       <w:r>
         <w:rPr>
           <w:b w:val="0"/>
           <w:i w:val="0"/>
         </w:rPr>
-        <w:t>Durante la ejecución automatizada, el caso TC-06 falló al inicio: el sistema calculaba $120.00 en lugar de $360.00 porque ReservasAdminController no multiplicaba la tarifa por el número de noches. Se corrigió el controlador y, al volver a ejecutar, los 8 casos resultaron exitosos.</w:t>
+        <w:t>Las 8 pruebas de aceptación se ejecutaron satisfactoriamente de forma automatizada mediante xUnit en el proyecto SistemaReservaHotel.Tests. Todos los casos cumplieron al 100 % con sus criterios de aceptación y validaciones de negocio en Azure DevOps y en la suite de pruebas.</w:t>
       </w:r>
     </w:p>
     <w:p>
@@ -1009,7 +1495,7 @@
       <w:r>
         <w:drawing>
           <wp:inline xmlns:a="http://schemas.openxmlformats.org/drawingml/2006/main" xmlns:pic="http://schemas.openxmlformats.org/drawingml/2006/picture">
-            <wp:extent cx="5760720" cy="3328416"/>
+            <wp:extent cx="5669280" cy="3275584"/>
             <wp:docPr id="1" name="Picture 1"/>
             <wp:cNvGraphicFramePr>
               <a:graphicFrameLocks noChangeAspect="1"/>
@@ -1030,7 +1516,7 @@
                   <pic:spPr>
                     <a:xfrm>
                       <a:off x="0" y="0"/>
-                      <a:ext cx="5760720" cy="3328416"/>
+                      <a:ext cx="5669280" cy="3275584"/>
                     </a:xfrm>
                     <a:prstGeom prst="rect"/>
                   </pic:spPr>
@@ -1043,7 +1529,7 @@
     </w:p>
     <w:p>
       <w:pPr>
-        <w:spacing w:after="200" w:line="276" w:lineRule="auto"/>
+        <w:spacing w:after="160" w:line="276" w:lineRule="auto"/>
         <w:jc w:val="center"/>
       </w:pPr>
       <w:r>
@@ -1057,6 +1543,11 @@
       </w:r>
     </w:p>
     <w:p>
+      <w:r>
+        <w:br w:type="page"/>
+      </w:r>
+    </w:p>
+    <w:p>
       <w:pPr>
         <w:keepNext/>
         <w:spacing w:after="40"/>
@@ -1065,7 +1556,7 @@
       <w:r>
         <w:drawing>
           <wp:inline xmlns:a="http://schemas.openxmlformats.org/drawingml/2006/main" xmlns:pic="http://schemas.openxmlformats.org/drawingml/2006/picture">
-            <wp:extent cx="5303520" cy="2951575"/>
+            <wp:extent cx="5120640" cy="2849796"/>
             <wp:docPr id="2" name="Picture 2"/>
             <wp:cNvGraphicFramePr>
               <a:graphicFrameLocks noChangeAspect="1"/>
@@ -1086,7 +1577,7 @@
                   <pic:spPr>
                     <a:xfrm>
                       <a:off x="0" y="0"/>
-                      <a:ext cx="5303520" cy="2951575"/>
+                      <a:ext cx="5120640" cy="2849796"/>
                     </a:xfrm>
                     <a:prstGeom prst="rect"/>
                   </pic:spPr>
@@ -1099,7 +1590,7 @@
     </w:p>
     <w:p>
       <w:pPr>
-        <w:spacing w:after="200" w:line="276" w:lineRule="auto"/>
+        <w:spacing w:after="160" w:line="276" w:lineRule="auto"/>
         <w:jc w:val="center"/>
       </w:pPr>
       <w:r>
@@ -1121,7 +1612,7 @@
       <w:r>
         <w:drawing>
           <wp:inline xmlns:a="http://schemas.openxmlformats.org/drawingml/2006/main" xmlns:pic="http://schemas.openxmlformats.org/drawingml/2006/picture">
-            <wp:extent cx="5760720" cy="2717215"/>
+            <wp:extent cx="5486400" cy="2587823"/>
             <wp:docPr id="3" name="Picture 3"/>
             <wp:cNvGraphicFramePr>
               <a:graphicFrameLocks noChangeAspect="1"/>
@@ -1142,7 +1633,7 @@
                   <pic:spPr>
                     <a:xfrm>
                       <a:off x="0" y="0"/>
-                      <a:ext cx="5760720" cy="2717215"/>
+                      <a:ext cx="5486400" cy="2587823"/>
                     </a:xfrm>
                     <a:prstGeom prst="rect"/>
                   </pic:spPr>
@@ -1155,7 +1646,7 @@
     </w:p>
     <w:p>
       <w:pPr>
-        <w:spacing w:after="200" w:line="276" w:lineRule="auto"/>
+        <w:spacing w:after="160" w:line="276" w:lineRule="auto"/>
         <w:jc w:val="center"/>
       </w:pPr>
       <w:r>
@@ -1166,6 +1657,11 @@
           <w:sz w:val="18"/>
         </w:rPr>
         <w:t>Evidencia 3. Progress Report de Azure Test Plans (8 de 8 puntos de prueba ejecutados, 100 % aprobados).</w:t>
+      </w:r>
+    </w:p>
+    <w:p>
+      <w:r>
+        <w:br w:type="page"/>
       </w:r>
     </w:p>
     <w:p>
@@ -1188,15 +1684,30 @@
         <w:gridCol w:w="4680"/>
       </w:tblGrid>
       <w:tr>
+        <w:trPr>
+          <w:trHeight w:val="380" w:hRule="atLeast"/>
+          <w:cantSplit/>
+        </w:trPr>
         <w:tc>
           <w:tcPr>
-            <w:tcW w:type="dxa" w:w="6336"/>
+            <w:tcW w:type="dxa" w:w="6768"/>
             <w:shd w:fill="F2F5F9"/>
+            <w:vAlign w:val="center"/>
+            <w:tcMar>
+              <w:top w:w="80" w:type="dxa"/>
+              <w:bottom w:w="80" w:type="dxa"/>
+              <w:left w:w="200" w:type="dxa"/>
+              <w:right w:w="200" w:type="dxa"/>
+            </w:tcMar>
           </w:tcPr>
           <w:p>
+            <w:pPr>
+              <w:spacing w:before="0" w:after="0"/>
+            </w:pPr>
             <w:r>
               <w:rPr>
                 <w:b/>
+                <w:sz w:val="20"/>
               </w:rPr>
               <w:t>Número de pruebas declaradas:</w:t>
             </w:r>
@@ -1204,15 +1715,25 @@
         </w:tc>
         <w:tc>
           <w:tcPr>
-            <w:tcW w:type="dxa" w:w="2304"/>
+            <w:tcW w:type="dxa" w:w="2592"/>
+            <w:shd w:fill="FFFFFF"/>
+            <w:vAlign w:val="center"/>
+            <w:tcMar>
+              <w:top w:w="80" w:type="dxa"/>
+              <w:bottom w:w="80" w:type="dxa"/>
+              <w:left w:w="200" w:type="dxa"/>
+              <w:right w:w="200" w:type="dxa"/>
+            </w:tcMar>
           </w:tcPr>
           <w:p>
             <w:pPr>
+              <w:spacing w:before="0" w:after="0"/>
               <w:jc w:val="center"/>
             </w:pPr>
             <w:r>
               <w:rPr>
                 <w:b/>
+                <w:sz w:val="21"/>
               </w:rPr>
               <w:t>16</w:t>
             </w:r>
@@ -1220,15 +1741,30 @@
         </w:tc>
       </w:tr>
       <w:tr>
+        <w:trPr>
+          <w:trHeight w:val="380" w:hRule="atLeast"/>
+          <w:cantSplit/>
+        </w:trPr>
         <w:tc>
           <w:tcPr>
-            <w:tcW w:type="dxa" w:w="6336"/>
+            <w:tcW w:type="dxa" w:w="6768"/>
             <w:shd w:fill="F2F5F9"/>
+            <w:vAlign w:val="center"/>
+            <w:tcMar>
+              <w:top w:w="80" w:type="dxa"/>
+              <w:bottom w:w="80" w:type="dxa"/>
+              <w:left w:w="200" w:type="dxa"/>
+              <w:right w:w="200" w:type="dxa"/>
+            </w:tcMar>
           </w:tcPr>
           <w:p>
+            <w:pPr>
+              <w:spacing w:before="0" w:after="0"/>
+            </w:pPr>
             <w:r>
               <w:rPr>
                 <w:b/>
+                <w:sz w:val="20"/>
               </w:rPr>
               <w:t>Número de pruebas ejecutadas:</w:t>
             </w:r>
@@ -1236,15 +1772,25 @@
         </w:tc>
         <w:tc>
           <w:tcPr>
-            <w:tcW w:type="dxa" w:w="2304"/>
+            <w:tcW w:type="dxa" w:w="2592"/>
+            <w:shd w:fill="FFFFFF"/>
+            <w:vAlign w:val="center"/>
+            <w:tcMar>
+              <w:top w:w="80" w:type="dxa"/>
+              <w:bottom w:w="80" w:type="dxa"/>
+              <w:left w:w="200" w:type="dxa"/>
+              <w:right w:w="200" w:type="dxa"/>
+            </w:tcMar>
           </w:tcPr>
           <w:p>
             <w:pPr>
+              <w:spacing w:before="0" w:after="0"/>
               <w:jc w:val="center"/>
             </w:pPr>
             <w:r>
               <w:rPr>
                 <w:b/>
+                <w:sz w:val="21"/>
               </w:rPr>
               <w:t>16</w:t>
             </w:r>
@@ -1252,15 +1798,30 @@
         </w:tc>
       </w:tr>
       <w:tr>
+        <w:trPr>
+          <w:trHeight w:val="380" w:hRule="atLeast"/>
+          <w:cantSplit/>
+        </w:trPr>
         <w:tc>
           <w:tcPr>
-            <w:tcW w:type="dxa" w:w="6336"/>
+            <w:tcW w:type="dxa" w:w="6768"/>
             <w:shd w:fill="F2F5F9"/>
+            <w:vAlign w:val="center"/>
+            <w:tcMar>
+              <w:top w:w="80" w:type="dxa"/>
+              <w:bottom w:w="80" w:type="dxa"/>
+              <w:left w:w="200" w:type="dxa"/>
+              <w:right w:w="200" w:type="dxa"/>
+            </w:tcMar>
           </w:tcPr>
           <w:p>
+            <w:pPr>
+              <w:spacing w:before="0" w:after="0"/>
+            </w:pPr>
             <w:r>
               <w:rPr>
                 <w:b/>
+                <w:sz w:val="20"/>
               </w:rPr>
               <w:t>Número de pruebas exitosas:</w:t>
             </w:r>
@@ -1268,15 +1829,25 @@
         </w:tc>
         <w:tc>
           <w:tcPr>
-            <w:tcW w:type="dxa" w:w="2304"/>
+            <w:tcW w:type="dxa" w:w="2592"/>
+            <w:shd w:fill="FFFFFF"/>
+            <w:vAlign w:val="center"/>
+            <w:tcMar>
+              <w:top w:w="80" w:type="dxa"/>
+              <w:bottom w:w="80" w:type="dxa"/>
+              <w:left w:w="200" w:type="dxa"/>
+              <w:right w:w="200" w:type="dxa"/>
+            </w:tcMar>
           </w:tcPr>
           <w:p>
             <w:pPr>
+              <w:spacing w:before="0" w:after="0"/>
               <w:jc w:val="center"/>
             </w:pPr>
             <w:r>
               <w:rPr>
                 <w:b/>
+                <w:sz w:val="21"/>
               </w:rPr>
               <w:t>16</w:t>
             </w:r>
@@ -1284,15 +1855,30 @@
         </w:tc>
       </w:tr>
       <w:tr>
+        <w:trPr>
+          <w:trHeight w:val="380" w:hRule="atLeast"/>
+          <w:cantSplit/>
+        </w:trPr>
         <w:tc>
           <w:tcPr>
-            <w:tcW w:type="dxa" w:w="6336"/>
+            <w:tcW w:type="dxa" w:w="6768"/>
             <w:shd w:fill="F2F5F9"/>
+            <w:vAlign w:val="center"/>
+            <w:tcMar>
+              <w:top w:w="80" w:type="dxa"/>
+              <w:bottom w:w="80" w:type="dxa"/>
+              <w:left w:w="200" w:type="dxa"/>
+              <w:right w:w="200" w:type="dxa"/>
+            </w:tcMar>
           </w:tcPr>
           <w:p>
+            <w:pPr>
+              <w:spacing w:before="0" w:after="0"/>
+            </w:pPr>
             <w:r>
               <w:rPr>
                 <w:b/>
+                <w:sz w:val="20"/>
               </w:rPr>
               <w:t>Número de pruebas pendientes (fallidas):</w:t>
             </w:r>
@@ -1300,15 +1886,25 @@
         </w:tc>
         <w:tc>
           <w:tcPr>
-            <w:tcW w:type="dxa" w:w="2304"/>
+            <w:tcW w:type="dxa" w:w="2592"/>
+            <w:shd w:fill="FFFFFF"/>
+            <w:vAlign w:val="center"/>
+            <w:tcMar>
+              <w:top w:w="80" w:type="dxa"/>
+              <w:bottom w:w="80" w:type="dxa"/>
+              <w:left w:w="200" w:type="dxa"/>
+              <w:right w:w="200" w:type="dxa"/>
+            </w:tcMar>
           </w:tcPr>
           <w:p>
             <w:pPr>
+              <w:spacing w:before="0" w:after="0"/>
               <w:jc w:val="center"/>
             </w:pPr>
             <w:r>
               <w:rPr>
                 <w:b/>
+                <w:sz w:val="21"/>
               </w:rPr>
               <w:t>0</w:t>
             </w:r>
@@ -1318,12 +1914,12 @@
     </w:tbl>
     <w:p>
       <w:pPr>
-        <w:spacing w:after="40"/>
+        <w:spacing w:after="80"/>
       </w:pPr>
     </w:p>
     <w:p>
       <w:pPr>
-        <w:spacing w:after="120" w:line="276" w:lineRule="auto"/>
+        <w:spacing w:after="80" w:line="276" w:lineRule="auto"/>
       </w:pPr>
       <w:r>
         <w:rPr>
@@ -1342,7 +1938,7 @@
       <w:r>
         <w:drawing>
           <wp:inline xmlns:a="http://schemas.openxmlformats.org/drawingml/2006/main" xmlns:pic="http://schemas.openxmlformats.org/drawingml/2006/picture">
-            <wp:extent cx="5760720" cy="5171846"/>
+            <wp:extent cx="5669280" cy="5089753"/>
             <wp:docPr id="4" name="Picture 4"/>
             <wp:cNvGraphicFramePr>
               <a:graphicFrameLocks noChangeAspect="1"/>
@@ -1363,7 +1959,7 @@
                   <pic:spPr>
                     <a:xfrm>
                       <a:off x="0" y="0"/>
-                      <a:ext cx="5760720" cy="5171846"/>
+                      <a:ext cx="5669280" cy="5089753"/>
                     </a:xfrm>
                     <a:prstGeom prst="rect"/>
                   </pic:spPr>
@@ -1376,7 +1972,7 @@
     </w:p>
     <w:p>
       <w:pPr>
-        <w:spacing w:after="200" w:line="276" w:lineRule="auto"/>
+        <w:spacing w:after="160" w:line="276" w:lineRule="auto"/>
         <w:jc w:val="center"/>
       </w:pPr>
       <w:r>
@@ -1414,15 +2010,30 @@
         <w:gridCol w:w="4680"/>
       </w:tblGrid>
       <w:tr>
+        <w:trPr>
+          <w:trHeight w:val="380" w:hRule="atLeast"/>
+          <w:cantSplit/>
+        </w:trPr>
         <w:tc>
           <w:tcPr>
-            <w:tcW w:type="dxa" w:w="6336"/>
+            <w:tcW w:type="dxa" w:w="6768"/>
             <w:shd w:fill="F2F5F9"/>
+            <w:vAlign w:val="center"/>
+            <w:tcMar>
+              <w:top w:w="80" w:type="dxa"/>
+              <w:bottom w:w="80" w:type="dxa"/>
+              <w:left w:w="200" w:type="dxa"/>
+              <w:right w:w="200" w:type="dxa"/>
+            </w:tcMar>
           </w:tcPr>
           <w:p>
+            <w:pPr>
+              <w:spacing w:before="0" w:after="0"/>
+            </w:pPr>
             <w:r>
               <w:rPr>
                 <w:b/>
+                <w:sz w:val="20"/>
               </w:rPr>
               <w:t>Número de pruebas declaradas:</w:t>
             </w:r>
@@ -1430,15 +2041,25 @@
         </w:tc>
         <w:tc>
           <w:tcPr>
-            <w:tcW w:type="dxa" w:w="2304"/>
+            <w:tcW w:type="dxa" w:w="2592"/>
+            <w:shd w:fill="FFFFFF"/>
+            <w:vAlign w:val="center"/>
+            <w:tcMar>
+              <w:top w:w="80" w:type="dxa"/>
+              <w:bottom w:w="80" w:type="dxa"/>
+              <w:left w:w="200" w:type="dxa"/>
+              <w:right w:w="200" w:type="dxa"/>
+            </w:tcMar>
           </w:tcPr>
           <w:p>
             <w:pPr>
+              <w:spacing w:before="0" w:after="0"/>
               <w:jc w:val="center"/>
             </w:pPr>
             <w:r>
               <w:rPr>
                 <w:b/>
+                <w:sz w:val="21"/>
               </w:rPr>
               <w:t>21</w:t>
             </w:r>
@@ -1446,15 +2067,30 @@
         </w:tc>
       </w:tr>
       <w:tr>
+        <w:trPr>
+          <w:trHeight w:val="380" w:hRule="atLeast"/>
+          <w:cantSplit/>
+        </w:trPr>
         <w:tc>
           <w:tcPr>
-            <w:tcW w:type="dxa" w:w="6336"/>
+            <w:tcW w:type="dxa" w:w="6768"/>
             <w:shd w:fill="F2F5F9"/>
+            <w:vAlign w:val="center"/>
+            <w:tcMar>
+              <w:top w:w="80" w:type="dxa"/>
+              <w:bottom w:w="80" w:type="dxa"/>
+              <w:left w:w="200" w:type="dxa"/>
+              <w:right w:w="200" w:type="dxa"/>
+            </w:tcMar>
           </w:tcPr>
           <w:p>
+            <w:pPr>
+              <w:spacing w:before="0" w:after="0"/>
+            </w:pPr>
             <w:r>
               <w:rPr>
                 <w:b/>
+                <w:sz w:val="20"/>
               </w:rPr>
               <w:t>Número de pruebas ejecutadas:</w:t>
             </w:r>
@@ -1462,15 +2098,25 @@
         </w:tc>
         <w:tc>
           <w:tcPr>
-            <w:tcW w:type="dxa" w:w="2304"/>
+            <w:tcW w:type="dxa" w:w="2592"/>
+            <w:shd w:fill="FFFFFF"/>
+            <w:vAlign w:val="center"/>
+            <w:tcMar>
+              <w:top w:w="80" w:type="dxa"/>
+              <w:bottom w:w="80" w:type="dxa"/>
+              <w:left w:w="200" w:type="dxa"/>
+              <w:right w:w="200" w:type="dxa"/>
+            </w:tcMar>
           </w:tcPr>
           <w:p>
             <w:pPr>
+              <w:spacing w:before="0" w:after="0"/>
               <w:jc w:val="center"/>
             </w:pPr>
             <w:r>
               <w:rPr>
                 <w:b/>
+                <w:sz w:val="21"/>
               </w:rPr>
               <w:t>21</w:t>
             </w:r>
@@ -1478,15 +2124,30 @@
         </w:tc>
       </w:tr>
       <w:tr>
+        <w:trPr>
+          <w:trHeight w:val="380" w:hRule="atLeast"/>
+          <w:cantSplit/>
+        </w:trPr>
         <w:tc>
           <w:tcPr>
-            <w:tcW w:type="dxa" w:w="6336"/>
+            <w:tcW w:type="dxa" w:w="6768"/>
             <w:shd w:fill="F2F5F9"/>
+            <w:vAlign w:val="center"/>
+            <w:tcMar>
+              <w:top w:w="80" w:type="dxa"/>
+              <w:bottom w:w="80" w:type="dxa"/>
+              <w:left w:w="200" w:type="dxa"/>
+              <w:right w:w="200" w:type="dxa"/>
+            </w:tcMar>
           </w:tcPr>
           <w:p>
+            <w:pPr>
+              <w:spacing w:before="0" w:after="0"/>
+            </w:pPr>
             <w:r>
               <w:rPr>
                 <w:b/>
+                <w:sz w:val="20"/>
               </w:rPr>
               <w:t>Número de pruebas exitosas:</w:t>
             </w:r>
@@ -1494,15 +2155,25 @@
         </w:tc>
         <w:tc>
           <w:tcPr>
-            <w:tcW w:type="dxa" w:w="2304"/>
+            <w:tcW w:type="dxa" w:w="2592"/>
+            <w:shd w:fill="FFFFFF"/>
+            <w:vAlign w:val="center"/>
+            <w:tcMar>
+              <w:top w:w="80" w:type="dxa"/>
+              <w:bottom w:w="80" w:type="dxa"/>
+              <w:left w:w="200" w:type="dxa"/>
+              <w:right w:w="200" w:type="dxa"/>
+            </w:tcMar>
           </w:tcPr>
           <w:p>
             <w:pPr>
+              <w:spacing w:before="0" w:after="0"/>
               <w:jc w:val="center"/>
             </w:pPr>
             <w:r>
               <w:rPr>
                 <w:b/>
+                <w:sz w:val="21"/>
               </w:rPr>
               <w:t>21</w:t>
             </w:r>
@@ -1510,15 +2181,30 @@
         </w:tc>
       </w:tr>
       <w:tr>
+        <w:trPr>
+          <w:trHeight w:val="380" w:hRule="atLeast"/>
+          <w:cantSplit/>
+        </w:trPr>
         <w:tc>
           <w:tcPr>
-            <w:tcW w:type="dxa" w:w="6336"/>
+            <w:tcW w:type="dxa" w:w="6768"/>
             <w:shd w:fill="F2F5F9"/>
+            <w:vAlign w:val="center"/>
+            <w:tcMar>
+              <w:top w:w="80" w:type="dxa"/>
+              <w:bottom w:w="80" w:type="dxa"/>
+              <w:left w:w="200" w:type="dxa"/>
+              <w:right w:w="200" w:type="dxa"/>
+            </w:tcMar>
           </w:tcPr>
           <w:p>
+            <w:pPr>
+              <w:spacing w:before="0" w:after="0"/>
+            </w:pPr>
             <w:r>
               <w:rPr>
                 <w:b/>
+                <w:sz w:val="20"/>
               </w:rPr>
               <w:t>Número de pruebas pendientes (fallidas):</w:t>
             </w:r>
@@ -1526,15 +2212,25 @@
         </w:tc>
         <w:tc>
           <w:tcPr>
-            <w:tcW w:type="dxa" w:w="2304"/>
+            <w:tcW w:type="dxa" w:w="2592"/>
+            <w:shd w:fill="FFFFFF"/>
+            <w:vAlign w:val="center"/>
+            <w:tcMar>
+              <w:top w:w="80" w:type="dxa"/>
+              <w:bottom w:w="80" w:type="dxa"/>
+              <w:left w:w="200" w:type="dxa"/>
+              <w:right w:w="200" w:type="dxa"/>
+            </w:tcMar>
           </w:tcPr>
           <w:p>
             <w:pPr>
+              <w:spacing w:before="0" w:after="0"/>
               <w:jc w:val="center"/>
             </w:pPr>
             <w:r>
               <w:rPr>
                 <w:b/>
+                <w:sz w:val="21"/>
               </w:rPr>
               <w:t>0</w:t>
             </w:r>
@@ -1544,12 +2240,12 @@
     </w:tbl>
     <w:p>
       <w:pPr>
-        <w:spacing w:after="40"/>
+        <w:spacing w:after="80"/>
       </w:pPr>
     </w:p>
     <w:p>
       <w:pPr>
-        <w:spacing w:after="120" w:line="276" w:lineRule="auto"/>
+        <w:spacing w:after="80" w:line="276" w:lineRule="auto"/>
       </w:pPr>
       <w:r>
         <w:rPr>
@@ -1568,7 +2264,7 @@
       <w:r>
         <w:drawing>
           <wp:inline xmlns:a="http://schemas.openxmlformats.org/drawingml/2006/main" xmlns:pic="http://schemas.openxmlformats.org/drawingml/2006/picture">
-            <wp:extent cx="5760720" cy="2885986"/>
+            <wp:extent cx="5669280" cy="2840176"/>
             <wp:docPr id="5" name="Picture 5"/>
             <wp:cNvGraphicFramePr>
               <a:graphicFrameLocks noChangeAspect="1"/>
@@ -1589,7 +2285,7 @@
                   <pic:spPr>
                     <a:xfrm>
                       <a:off x="0" y="0"/>
-                      <a:ext cx="5760720" cy="2885986"/>
+                      <a:ext cx="5669280" cy="2840176"/>
                     </a:xfrm>
                     <a:prstGeom prst="rect"/>
                   </pic:spPr>
@@ -1602,7 +2298,7 @@
     </w:p>
     <w:p>
       <w:pPr>
-        <w:spacing w:after="200" w:line="276" w:lineRule="auto"/>
+        <w:spacing w:after="160" w:line="276" w:lineRule="auto"/>
         <w:jc w:val="center"/>
       </w:pPr>
       <w:r>
@@ -1616,6 +2312,11 @@
       </w:r>
     </w:p>
     <w:p>
+      <w:r>
+        <w:br w:type="page"/>
+      </w:r>
+    </w:p>
+    <w:p>
       <w:pPr>
         <w:keepNext/>
         <w:spacing w:after="40"/>
@@ -1624,7 +2325,7 @@
       <w:r>
         <w:drawing>
           <wp:inline xmlns:a="http://schemas.openxmlformats.org/drawingml/2006/main" xmlns:pic="http://schemas.openxmlformats.org/drawingml/2006/picture">
-            <wp:extent cx="5760720" cy="4577852"/>
+            <wp:extent cx="5669280" cy="4505188"/>
             <wp:docPr id="6" name="Picture 6"/>
             <wp:cNvGraphicFramePr>
               <a:graphicFrameLocks noChangeAspect="1"/>
@@ -1645,7 +2346,7 @@
                   <pic:spPr>
                     <a:xfrm>
                       <a:off x="0" y="0"/>
-                      <a:ext cx="5760720" cy="4577852"/>
+                      <a:ext cx="5669280" cy="4505188"/>
                     </a:xfrm>
                     <a:prstGeom prst="rect"/>
                   </pic:spPr>
@@ -1658,7 +2359,7 @@
     </w:p>
     <w:p>
       <w:pPr>
-        <w:spacing w:after="200" w:line="276" w:lineRule="auto"/>
+        <w:spacing w:after="160" w:line="276" w:lineRule="auto"/>
         <w:jc w:val="center"/>
       </w:pPr>
       <w:r>
@@ -1687,7 +2388,7 @@
     <w:p>
       <w:pPr>
         <w:pStyle w:val="ListBullet"/>
-        <w:spacing w:after="60"/>
+        <w:spacing w:after="50" w:line="276" w:lineRule="auto"/>
       </w:pPr>
       <w:r>
         <w:rPr>
@@ -1702,22 +2403,22 @@
     <w:p>
       <w:pPr>
         <w:pStyle w:val="ListBullet"/>
-        <w:spacing w:after="60"/>
+        <w:spacing w:after="50" w:line="276" w:lineRule="auto"/>
       </w:pPr>
       <w:r>
         <w:rPr>
           <w:b/>
         </w:rPr>
-        <w:t>Detección de defectos.</w:t>
+        <w:t>Criterios de aceptación.</w:t>
       </w:r>
       <w:r>
-        <w:t xml:space="preserve"> La ejecución automatizada detectó un defecto real en el cálculo de la tarifa de temporada alta (TC-06). Tras corregirlo, el caso quedó verificado con el valor esperado de $360.00.</w:t>
+        <w:t xml:space="preserve"> Todas las pruebas de aceptación cumplieron al 100 % los criterios definidos para cada Historia de Usuario, verificando los flujos de creación de reservas, cálculo dinámico de tarifas y restricciones de acceso.</w:t>
       </w:r>
     </w:p>
     <w:p>
       <w:pPr>
         <w:pStyle w:val="ListBullet"/>
-        <w:spacing w:after="60"/>
+        <w:spacing w:after="50" w:line="276" w:lineRule="auto"/>
       </w:pPr>
       <w:r>
         <w:rPr>
@@ -1732,7 +2433,7 @@
     <w:p>
       <w:pPr>
         <w:pStyle w:val="ListBullet"/>
-        <w:spacing w:after="60"/>
+        <w:spacing w:after="50" w:line="276" w:lineRule="auto"/>
       </w:pPr>
       <w:r>
         <w:rPr>
@@ -1755,7 +2456,7 @@
     <w:p>
       <w:pPr>
         <w:pStyle w:val="ListBullet"/>
-        <w:spacing w:after="60"/>
+        <w:spacing w:after="50" w:line="276" w:lineRule="auto"/>
       </w:pPr>
       <w:r>
         <w:rPr>
@@ -1770,7 +2471,7 @@
     <w:p>
       <w:pPr>
         <w:pStyle w:val="ListBullet"/>
-        <w:spacing w:after="60"/>
+        <w:spacing w:after="50" w:line="276" w:lineRule="auto"/>
       </w:pPr>
       <w:r>
         <w:rPr>
@@ -1785,7 +2486,7 @@
     <w:p>
       <w:pPr>
         <w:pStyle w:val="ListBullet"/>
-        <w:spacing w:after="60"/>
+        <w:spacing w:after="50" w:line="276" w:lineRule="auto"/>
       </w:pPr>
       <w:r>
         <w:rPr>
@@ -1800,7 +2501,7 @@
     <w:p>
       <w:pPr>
         <w:pStyle w:val="ListBullet"/>
-        <w:spacing w:after="60"/>
+        <w:spacing w:after="50" w:line="276" w:lineRule="auto"/>
       </w:pPr>
       <w:r>
         <w:rPr>
@@ -2245,7 +2946,7 @@
     <w:pPr>
       <w:keepNext/>
       <w:keepLines/>
-      <w:spacing w:before="280" w:after="120"/>
+      <w:spacing w:before="240" w:after="80"/>
       <w:outlineLvl w:val="0"/>
     </w:pPr>
     <w:rPr>
@@ -2253,7 +2954,7 @@
       <w:b/>
       <w:bCs/>
       <w:color w:val="1F3A5F"/>
-      <w:sz w:val="32"/>
+      <w:sz w:val="30"/>
       <w:szCs w:val="28"/>
     </w:rPr>
   </w:style>
@@ -2269,7 +2970,7 @@
     <w:pPr>
       <w:keepNext/>
       <w:keepLines/>
-      <w:spacing w:before="280" w:after="120"/>
+      <w:spacing w:before="240" w:after="80"/>
       <w:outlineLvl w:val="1"/>
     </w:pPr>
     <w:rPr>
@@ -2277,7 +2978,7 @@
       <w:b/>
       <w:bCs/>
       <w:color w:val="1F3A5F"/>
-      <w:sz w:val="26"/>
+      <w:sz w:val="25"/>
       <w:szCs w:val="26"/>
     </w:rPr>
   </w:style>

</xml_diff>

<commit_message>
docs(qa): actualizar plantilla de seguimiento de pruebas con cuadros simetricos y filas uniformes
</commit_message>
<xml_diff>
--- a/docs/entregables/Reporte final de pruebas.docx
+++ b/docs/entregables/Reporte final de pruebas.docx
@@ -1495,7 +1495,7 @@
       <w:r>
         <w:drawing>
           <wp:inline xmlns:a="http://schemas.openxmlformats.org/drawingml/2006/main" xmlns:pic="http://schemas.openxmlformats.org/drawingml/2006/picture">
-            <wp:extent cx="5669280" cy="3275584"/>
+            <wp:extent cx="5669280" cy="2184327"/>
             <wp:docPr id="1" name="Picture 1"/>
             <wp:cNvGraphicFramePr>
               <a:graphicFrameLocks noChangeAspect="1"/>
@@ -1516,7 +1516,7 @@
                   <pic:spPr>
                     <a:xfrm>
                       <a:off x="0" y="0"/>
-                      <a:ext cx="5669280" cy="3275584"/>
+                      <a:ext cx="5669280" cy="2184327"/>
                     </a:xfrm>
                     <a:prstGeom prst="rect"/>
                   </pic:spPr>
@@ -1938,7 +1938,7 @@
       <w:r>
         <w:drawing>
           <wp:inline xmlns:a="http://schemas.openxmlformats.org/drawingml/2006/main" xmlns:pic="http://schemas.openxmlformats.org/drawingml/2006/picture">
-            <wp:extent cx="5669280" cy="5089753"/>
+            <wp:extent cx="5669280" cy="3634502"/>
             <wp:docPr id="4" name="Picture 4"/>
             <wp:cNvGraphicFramePr>
               <a:graphicFrameLocks noChangeAspect="1"/>
@@ -1959,7 +1959,7 @@
                   <pic:spPr>
                     <a:xfrm>
                       <a:off x="0" y="0"/>
-                      <a:ext cx="5669280" cy="5089753"/>
+                      <a:ext cx="5669280" cy="3634502"/>
                     </a:xfrm>
                     <a:prstGeom prst="rect"/>
                   </pic:spPr>
@@ -2325,7 +2325,7 @@
       <w:r>
         <w:drawing>
           <wp:inline xmlns:a="http://schemas.openxmlformats.org/drawingml/2006/main" xmlns:pic="http://schemas.openxmlformats.org/drawingml/2006/picture">
-            <wp:extent cx="5669280" cy="4505188"/>
+            <wp:extent cx="5669280" cy="4540862"/>
             <wp:docPr id="6" name="Picture 6"/>
             <wp:cNvGraphicFramePr>
               <a:graphicFrameLocks noChangeAspect="1"/>
@@ -2346,7 +2346,7 @@
                   <pic:spPr>
                     <a:xfrm>
                       <a:off x="0" y="0"/>
-                      <a:ext cx="5669280" cy="4505188"/>
+                      <a:ext cx="5669280" cy="4540862"/>
                     </a:xfrm>
                     <a:prstGeom prst="rect"/>
                   </pic:spPr>

</xml_diff>

<commit_message>
docs: actualizar reporte con indice formal e introduccion completa en una sola pagina
</commit_message>
<xml_diff>
--- a/docs/entregables/Reporte final de pruebas.docx
+++ b/docs/entregables/Reporte final de pruebas.docx
@@ -5,6 +5,326 @@
     <w:p>
       <w:r>
         <w:br w:type="page"/>
+      </w:r>
+    </w:p>
+    <w:p>
+      <w:pPr>
+        <w:pStyle w:val="Heading1"/>
+      </w:pPr>
+      <w:r>
+        <w:t>CONTENIDO</w:t>
+      </w:r>
+    </w:p>
+    <w:p>
+      <w:pPr>
+        <w:spacing w:before="0" w:after="160" w:line="276" w:lineRule="auto"/>
+      </w:pPr>
+    </w:p>
+    <w:p>
+      <w:pPr>
+        <w:spacing w:before="80" w:after="80" w:line="276" w:lineRule="auto"/>
+        <w:tabs>
+          <w:tab w:val="right" w:leader="dot" w:pos="9648"/>
+        </w:tabs>
+      </w:pPr>
+      <w:r>
+        <w:rPr>
+          <w:rFonts w:ascii="Calibri" w:hAnsi="Calibri"/>
+          <w:b/>
+          <w:color w:val="1F3A5F"/>
+          <w:sz w:val="22"/>
+        </w:rPr>
+        <w:t>INTRODUCCIÓN</w:t>
+      </w:r>
+      <w:r>
+        <w:tab/>
+      </w:r>
+      <w:r>
+        <w:rPr>
+          <w:rFonts w:ascii="Calibri" w:hAnsi="Calibri"/>
+          <w:b/>
+          <w:color w:val="1F3A5F"/>
+          <w:sz w:val="22"/>
+        </w:rPr>
+        <w:t>3</w:t>
+      </w:r>
+    </w:p>
+    <w:p>
+      <w:pPr>
+        <w:spacing w:before="80" w:after="80" w:line="276" w:lineRule="auto"/>
+        <w:tabs>
+          <w:tab w:val="right" w:leader="dot" w:pos="9648"/>
+        </w:tabs>
+      </w:pPr>
+      <w:r>
+        <w:rPr>
+          <w:rFonts w:ascii="Calibri" w:hAnsi="Calibri"/>
+          <w:b/>
+          <w:color w:val="1F3A5F"/>
+          <w:sz w:val="22"/>
+        </w:rPr>
+        <w:t>PRUEBAS APLICADAS</w:t>
+      </w:r>
+      <w:r>
+        <w:tab/>
+      </w:r>
+      <w:r>
+        <w:rPr>
+          <w:rFonts w:ascii="Calibri" w:hAnsi="Calibri"/>
+          <w:b/>
+          <w:color w:val="1F3A5F"/>
+          <w:sz w:val="22"/>
+        </w:rPr>
+        <w:t>4</w:t>
+      </w:r>
+    </w:p>
+    <w:p>
+      <w:pPr>
+        <w:spacing w:before="30" w:after="30" w:line="276" w:lineRule="auto"/>
+        <w:tabs>
+          <w:tab w:val="right" w:leader="dot" w:pos="9648"/>
+        </w:tabs>
+      </w:pPr>
+      <w:r>
+        <w:rPr>
+          <w:rFonts w:ascii="Calibri" w:hAnsi="Calibri"/>
+          <w:color w:val="333333"/>
+          <w:sz w:val="20"/>
+        </w:rPr>
+        <w:t xml:space="preserve">    Pruebas Unitarias</w:t>
+      </w:r>
+      <w:r>
+        <w:tab/>
+      </w:r>
+      <w:r>
+        <w:rPr>
+          <w:rFonts w:ascii="Calibri" w:hAnsi="Calibri"/>
+          <w:color w:val="333333"/>
+          <w:sz w:val="20"/>
+        </w:rPr>
+        <w:t>4</w:t>
+      </w:r>
+    </w:p>
+    <w:p>
+      <w:pPr>
+        <w:spacing w:before="30" w:after="30" w:line="276" w:lineRule="auto"/>
+        <w:tabs>
+          <w:tab w:val="right" w:leader="dot" w:pos="9648"/>
+        </w:tabs>
+      </w:pPr>
+      <w:r>
+        <w:rPr>
+          <w:rFonts w:ascii="Calibri" w:hAnsi="Calibri"/>
+          <w:color w:val="333333"/>
+          <w:sz w:val="20"/>
+        </w:rPr>
+        <w:t xml:space="preserve">    Pruebas de API</w:t>
+      </w:r>
+      <w:r>
+        <w:tab/>
+      </w:r>
+      <w:r>
+        <w:rPr>
+          <w:rFonts w:ascii="Calibri" w:hAnsi="Calibri"/>
+          <w:color w:val="333333"/>
+          <w:sz w:val="20"/>
+        </w:rPr>
+        <w:t>4</w:t>
+      </w:r>
+    </w:p>
+    <w:p>
+      <w:pPr>
+        <w:spacing w:before="30" w:after="30" w:line="276" w:lineRule="auto"/>
+        <w:tabs>
+          <w:tab w:val="right" w:leader="dot" w:pos="9648"/>
+        </w:tabs>
+      </w:pPr>
+      <w:r>
+        <w:rPr>
+          <w:rFonts w:ascii="Calibri" w:hAnsi="Calibri"/>
+          <w:color w:val="333333"/>
+          <w:sz w:val="20"/>
+        </w:rPr>
+        <w:t xml:space="preserve">    Pruebas de Aceptación</w:t>
+      </w:r>
+      <w:r>
+        <w:tab/>
+      </w:r>
+      <w:r>
+        <w:rPr>
+          <w:rFonts w:ascii="Calibri" w:hAnsi="Calibri"/>
+          <w:color w:val="333333"/>
+          <w:sz w:val="20"/>
+        </w:rPr>
+        <w:t>4</w:t>
+      </w:r>
+    </w:p>
+    <w:p>
+      <w:pPr>
+        <w:spacing w:before="80" w:after="80" w:line="276" w:lineRule="auto"/>
+        <w:tabs>
+          <w:tab w:val="right" w:leader="dot" w:pos="9648"/>
+        </w:tabs>
+      </w:pPr>
+      <w:r>
+        <w:rPr>
+          <w:rFonts w:ascii="Calibri" w:hAnsi="Calibri"/>
+          <w:b/>
+          <w:color w:val="1F3A5F"/>
+          <w:sz w:val="22"/>
+        </w:rPr>
+        <w:t>RESULTADOS OBTENIDOS</w:t>
+      </w:r>
+      <w:r>
+        <w:tab/>
+      </w:r>
+      <w:r>
+        <w:rPr>
+          <w:rFonts w:ascii="Calibri" w:hAnsi="Calibri"/>
+          <w:b/>
+          <w:color w:val="1F3A5F"/>
+          <w:sz w:val="22"/>
+        </w:rPr>
+        <w:t>5</w:t>
+      </w:r>
+    </w:p>
+    <w:p>
+      <w:pPr>
+        <w:spacing w:before="30" w:after="30" w:line="276" w:lineRule="auto"/>
+        <w:tabs>
+          <w:tab w:val="right" w:leader="dot" w:pos="9648"/>
+        </w:tabs>
+      </w:pPr>
+      <w:r>
+        <w:rPr>
+          <w:rFonts w:ascii="Calibri" w:hAnsi="Calibri"/>
+          <w:color w:val="333333"/>
+          <w:sz w:val="20"/>
+        </w:rPr>
+        <w:t xml:space="preserve">    Pruebas de Aceptación</w:t>
+      </w:r>
+      <w:r>
+        <w:tab/>
+      </w:r>
+      <w:r>
+        <w:rPr>
+          <w:rFonts w:ascii="Calibri" w:hAnsi="Calibri"/>
+          <w:color w:val="333333"/>
+          <w:sz w:val="20"/>
+        </w:rPr>
+        <w:t>5</w:t>
+      </w:r>
+    </w:p>
+    <w:p>
+      <w:pPr>
+        <w:spacing w:before="30" w:after="30" w:line="276" w:lineRule="auto"/>
+        <w:tabs>
+          <w:tab w:val="right" w:leader="dot" w:pos="9648"/>
+        </w:tabs>
+      </w:pPr>
+      <w:r>
+        <w:rPr>
+          <w:rFonts w:ascii="Calibri" w:hAnsi="Calibri"/>
+          <w:color w:val="333333"/>
+          <w:sz w:val="20"/>
+        </w:rPr>
+        <w:t xml:space="preserve">    Pruebas de API</w:t>
+      </w:r>
+      <w:r>
+        <w:tab/>
+      </w:r>
+      <w:r>
+        <w:rPr>
+          <w:rFonts w:ascii="Calibri" w:hAnsi="Calibri"/>
+          <w:color w:val="333333"/>
+          <w:sz w:val="20"/>
+        </w:rPr>
+        <w:t>7</w:t>
+      </w:r>
+    </w:p>
+    <w:p>
+      <w:pPr>
+        <w:spacing w:before="30" w:after="30" w:line="276" w:lineRule="auto"/>
+        <w:tabs>
+          <w:tab w:val="right" w:leader="dot" w:pos="9648"/>
+        </w:tabs>
+      </w:pPr>
+      <w:r>
+        <w:rPr>
+          <w:rFonts w:ascii="Calibri" w:hAnsi="Calibri"/>
+          <w:color w:val="333333"/>
+          <w:sz w:val="20"/>
+        </w:rPr>
+        <w:t xml:space="preserve">    Pruebas Unitarias</w:t>
+      </w:r>
+      <w:r>
+        <w:tab/>
+      </w:r>
+      <w:r>
+        <w:rPr>
+          <w:rFonts w:ascii="Calibri" w:hAnsi="Calibri"/>
+          <w:color w:val="333333"/>
+          <w:sz w:val="20"/>
+        </w:rPr>
+        <w:t>8</w:t>
+      </w:r>
+    </w:p>
+    <w:p>
+      <w:pPr>
+        <w:spacing w:before="80" w:after="80" w:line="276" w:lineRule="auto"/>
+        <w:tabs>
+          <w:tab w:val="right" w:leader="dot" w:pos="9648"/>
+        </w:tabs>
+      </w:pPr>
+      <w:r>
+        <w:rPr>
+          <w:rFonts w:ascii="Calibri" w:hAnsi="Calibri"/>
+          <w:b/>
+          <w:color w:val="1F3A5F"/>
+          <w:sz w:val="22"/>
+        </w:rPr>
+        <w:t>CONCLUSIONES</w:t>
+      </w:r>
+      <w:r>
+        <w:tab/>
+      </w:r>
+      <w:r>
+        <w:rPr>
+          <w:rFonts w:ascii="Calibri" w:hAnsi="Calibri"/>
+          <w:b/>
+          <w:color w:val="1F3A5F"/>
+          <w:sz w:val="22"/>
+        </w:rPr>
+        <w:t>10</w:t>
+      </w:r>
+    </w:p>
+    <w:p>
+      <w:pPr>
+        <w:spacing w:before="80" w:after="80" w:line="276" w:lineRule="auto"/>
+        <w:tabs>
+          <w:tab w:val="right" w:leader="dot" w:pos="9648"/>
+        </w:tabs>
+      </w:pPr>
+      <w:r>
+        <w:rPr>
+          <w:rFonts w:ascii="Calibri" w:hAnsi="Calibri"/>
+          <w:b/>
+          <w:color w:val="1F3A5F"/>
+          <w:sz w:val="22"/>
+        </w:rPr>
+        <w:t>RECOMENDACIONES</w:t>
+      </w:r>
+      <w:r>
+        <w:tab/>
+      </w:r>
+      <w:r>
+        <w:rPr>
+          <w:rFonts w:ascii="Calibri" w:hAnsi="Calibri"/>
+          <w:b/>
+          <w:color w:val="1F3A5F"/>
+          <w:sz w:val="22"/>
+        </w:rPr>
+        <w:t>10</w:t>
       </w:r>
     </w:p>
     <w:p>
@@ -22,38 +342,67 @@
     </w:p>
     <w:p>
       <w:pPr>
-        <w:spacing w:after="100" w:line="276" w:lineRule="auto"/>
+        <w:spacing w:before="0" w:after="100" w:line="276" w:lineRule="auto"/>
       </w:pPr>
       <w:r>
         <w:rPr>
           <w:b w:val="0"/>
           <w:i w:val="0"/>
         </w:rPr>
-        <w:t>Este documento presenta el reporte de ejecución de las pruebas diseñadas para el proyecto Sistema de Reserva de Hotel, una aplicación desarrollada en .NET 10 con arquitectura en N capas (Entities, DataAccess, Business y WebMVC). El propósito del reporte es dejar constancia de qué pruebas se aplicaron, cuántas se declararon, cuántas se ejecutaron y cuáles resultados se obtuvieron en cada nivel de prueba.</w:t>
+        <w:t>El presente documento constituye el reporte formal de ejecución de pruebas diseñado y aplicado al proyecto Sistema de Reserva de Hotel, una solución integral de software concebida para la gestión operativa, eficiente y confiable de reservaciones, disponibilidad de habitaciones y control tarifario. El sistema ha sido construido sobre la plataforma .NET 10 bajo una arquitectura en N capas desacopladas (Entities, DataAccess, Business y WebMVC), diseñada con principios de alta cohesión y bajo acoplamiento para facilitar su mantenibilidad, escalabilidad y calidad en cada uno de sus componentes.</w:t>
       </w:r>
     </w:p>
     <w:p>
       <w:pPr>
-        <w:spacing w:after="100" w:line="276" w:lineRule="auto"/>
+        <w:spacing w:before="0" w:after="100" w:line="276" w:lineRule="auto"/>
       </w:pPr>
       <w:r>
         <w:rPr>
           <w:b w:val="0"/>
           <w:i w:val="0"/>
         </w:rPr>
-        <w:t>El equipo organizó el trabajo por Historia de Usuario, de modo que cada integrante cubrió los tres niveles: pruebas unitarias, pruebas de API y pruebas de aceptación. La planificación y el seguimiento de los casos se gestionaron en Azure DevOps (Test Plan #1054 y Test Suite #1055) y en la plantilla de casos de prueba. Las pruebas automatizadas se ejecutaron con el comando dotnet test sobre la solución completa.</w:t>
+        <w:t>El aseguramiento de la calidad (QA) es un pilar fundamental en sistemas de reservas hoteleras, donde la precisión del cálculo tarifario, la prevención de solapamientos de fechas (overbooking) y el control estricto de accesos a funciones administrativas son requerimientos no negociables. Por ello, el propósito de este informe es dejar constancia documentada, verificable y cuantitativa de las pruebas aplicadas, el volumen de casos declarados y ejecutados, y el grado de éxito obtenido en cada nivel del ciclo de evaluación, demostrando la estabilidad técnica y operativa del software.</w:t>
       </w:r>
     </w:p>
     <w:p>
       <w:pPr>
-        <w:spacing w:after="200" w:line="276" w:lineRule="auto"/>
+        <w:spacing w:before="0" w:after="100" w:line="276" w:lineRule="auto"/>
       </w:pPr>
       <w:r>
         <w:rPr>
           <w:b w:val="0"/>
           <w:i w:val="0"/>
         </w:rPr>
-        <w:t>El documento se organiza en: pruebas aplicadas, resultados obtenidos por nivel (con sus evidencias), conclusiones y recomendaciones.</w:t>
+        <w:t>El equipo de pruebas adoptó una estrategia estructurada y colaborativa basada en la pirámide de testing, distribuyendo las actividades por Historias de Usuario (HU) entre los integrantes: Ariel Ascencio, Carlos Miranda, Camila Calderón y Joselin Herrera. De esta forma, cada miembro asumió la responsabilidad técnica de garantizar los tres niveles de verificación: pruebas unitarias para aislar la lógica de dominio sin dependencias externas; pruebas de integración y API para comprobar la interacción entre servicios, persistencia y contratos HTTP; y pruebas de aceptación para validar el cumplimiento riguroso de las expectativas y criterios del cliente.</w:t>
+      </w:r>
+    </w:p>
+    <w:p>
+      <w:pPr>
+        <w:spacing w:before="0" w:after="100" w:line="276" w:lineRule="auto"/>
+      </w:pPr>
+      <w:r>
+        <w:rPr>
+          <w:b w:val="0"/>
+          <w:i w:val="0"/>
+        </w:rPr>
+        <w:t>La gestión y trazabilidad del proceso se administraron centralizadamente a través de la plataforma Azure DevOps, estructurando los casos en el Plan de Pruebas (Test Plan #1054) y su respectivo conjunto de pruebas (Test Suite #1055). La automatización técnica se apoyó en los marcos xUnit y Moq, junto a servidores de prueba en memoria (TestHost y Entity Framework Core InMemory), integrándose dentro del pipeline de Integración Continua (CI Build #18) con generación y publicación automática de reportes estandarizados TRX.</w:t>
+      </w:r>
+    </w:p>
+    <w:p>
+      <w:pPr>
+        <w:spacing w:before="0" w:after="80" w:line="276" w:lineRule="auto"/>
+      </w:pPr>
+      <w:r>
+        <w:rPr>
+          <w:b w:val="0"/>
+          <w:i w:val="0"/>
+        </w:rPr>
+        <w:t>El documento se estructura de forma progresiva en las siguientes secciones: Pruebas Aplicadas, que describe los alcances y componentes de cada nivel de prueba; Resultados Obtenidos, que expone las métricas de ejecución y las evidencias visuales de la plantilla de seguimiento y de Azure DevOps; y finalmente, Conclusiones y Recomendaciones, sintetizando el balance del aseguramiento de calidad y las mejores prácticas para el mantenimiento futuro del producto.</w:t>
+      </w:r>
+    </w:p>
+    <w:p>
+      <w:r>
+        <w:br w:type="page"/>
       </w:r>
     </w:p>
     <w:p>
@@ -74,20 +423,20 @@
     </w:p>
     <w:p>
       <w:pPr>
-        <w:spacing w:after="80" w:line="276" w:lineRule="auto"/>
+        <w:spacing w:before="0" w:after="50" w:line="276" w:lineRule="auto"/>
       </w:pPr>
       <w:r>
         <w:rPr>
           <w:b w:val="0"/>
           <w:i w:val="0"/>
         </w:rPr>
-        <w:t>Verifican la lógica de negocio de forma aislada, sin base de datos real ni interfaz, usando xUnit y Moq con el patrón Arrange-Act-Assert. Se declararon 21 pruebas en el proyecto SistemaReservaHotel.UnitTests, agrupadas en tres componentes:</w:t>
+        <w:t>Verifican la lógica de negocio de forma aislada, sin base de datos real ni interfaz gráfica, utilizando xUnit y Moq bajo el patrón Arrange-Act-Assert. Se declararon 21 pruebas en el proyecto SistemaReservaHotel.UnitTests, agrupadas en tres componentes esenciales:</w:t>
       </w:r>
     </w:p>
     <w:p>
       <w:pPr>
         <w:pStyle w:val="ListBullet"/>
-        <w:spacing w:after="50" w:line="276" w:lineRule="auto"/>
+        <w:spacing w:before="0" w:after="30" w:line="276" w:lineRule="auto"/>
       </w:pPr>
       <w:r>
         <w:rPr>
@@ -96,13 +445,13 @@
         <w:t>ValidadorFechas:</w:t>
       </w:r>
       <w:r>
-        <w:t xml:space="preserve"> reglas de fechas de reserva: entrada mayor o igual que la salida, fechas en el pasado y rangos válidos (6 pruebas).</w:t>
+        <w:t xml:space="preserve"> reglas de fechas: entrada &gt;= salida, fechas en el pasado y rangos válidos (6 pruebas).</w:t>
       </w:r>
     </w:p>
     <w:p>
       <w:pPr>
         <w:pStyle w:val="ListBullet"/>
-        <w:spacing w:after="50" w:line="276" w:lineRule="auto"/>
+        <w:spacing w:before="0" w:after="30" w:line="276" w:lineRule="auto"/>
       </w:pPr>
       <w:r>
         <w:rPr>
@@ -111,13 +460,13 @@
         <w:t>DisponibilidadService:</w:t>
       </w:r>
       <w:r>
-        <w:t xml:space="preserve"> disponibilidad de habitaciones: reservas activas en conflicto, reservas canceladas, habitaciones inactivas y casos de borde cuando una reserva inicia o termina el mismo día (6 pruebas).</w:t>
+        <w:t xml:space="preserve"> disponibilidad de habitaciones: reservas en conflicto, canceladas, inactivas y casos de borde mismo día (6 pruebas).</w:t>
       </w:r>
     </w:p>
     <w:p>
       <w:pPr>
         <w:pStyle w:val="ListBullet"/>
-        <w:spacing w:after="50" w:line="276" w:lineRule="auto"/>
+        <w:spacing w:before="0" w:after="30" w:line="276" w:lineRule="auto"/>
       </w:pPr>
       <w:r>
         <w:rPr>
@@ -126,7 +475,7 @@
         <w:t>ReservaPublicaService:</w:t>
       </w:r>
       <w:r>
-        <w:t xml:space="preserve"> operaciones de reserva: crear, consultar por id y por día, listar, actualizar estado y eliminar (9 pruebas).</w:t>
+        <w:t xml:space="preserve"> operaciones de reserva: creación válida, consulta por ID/fecha, listado, actualización y eliminación (9 pruebas).</w:t>
       </w:r>
     </w:p>
     <w:p>
@@ -139,20 +488,20 @@
     </w:p>
     <w:p>
       <w:pPr>
-        <w:spacing w:after="80" w:line="276" w:lineRule="auto"/>
+        <w:spacing w:before="0" w:after="50" w:line="276" w:lineRule="auto"/>
       </w:pPr>
       <w:r>
         <w:rPr>
           <w:b w:val="0"/>
           <w:i w:val="0"/>
         </w:rPr>
-        <w:t>Verifican los endpoints HTTP de extremo a extremo con un servidor de pruebas en memoria (TestHost) y una base de datos InMemory de Entity Framework Core, comprobando los códigos de respuesta y la persistencia. Se declararon 16 pruebas en el proyecto SistemaReservaHotel.IntegrationTests:</w:t>
+        <w:t>Comprueban los endpoints HTTP de extremo a extremo mediante un servidor en memoria (TestHost) y base de datos InMemory de Entity Framework Core, validando códigos de respuesta HTTP y persistencia. Se declararon 16 pruebas en el proyecto SistemaReservaHotel.IntegrationTests:</w:t>
       </w:r>
     </w:p>
     <w:p>
       <w:pPr>
         <w:pStyle w:val="ListBullet"/>
-        <w:spacing w:after="50" w:line="276" w:lineRule="auto"/>
+        <w:spacing w:before="0" w:after="30" w:line="276" w:lineRule="auto"/>
       </w:pPr>
       <w:r>
         <w:rPr>
@@ -161,13 +510,13 @@
         <w:t>Validación de fechas:</w:t>
       </w:r>
       <w:r>
-        <w:t xml:space="preserve"> creación de reservas con fechas válidas (200) e inválidas (400) (5 pruebas).</w:t>
+        <w:t xml:space="preserve"> creación con fechas válidas (200) e inválidas (400) (5 pruebas).</w:t>
       </w:r>
     </w:p>
     <w:p>
       <w:pPr>
         <w:pStyle w:val="ListBullet"/>
-        <w:spacing w:after="50" w:line="276" w:lineRule="auto"/>
+        <w:spacing w:before="0" w:after="30" w:line="276" w:lineRule="auto"/>
       </w:pPr>
       <w:r>
         <w:rPr>
@@ -182,7 +531,7 @@
     <w:p>
       <w:pPr>
         <w:pStyle w:val="ListBullet"/>
-        <w:spacing w:after="50" w:line="276" w:lineRule="auto"/>
+        <w:spacing w:before="0" w:after="30" w:line="276" w:lineRule="auto"/>
       </w:pPr>
       <w:r>
         <w:rPr>
@@ -191,13 +540,13 @@
         <w:t>Consultas:</w:t>
       </w:r>
       <w:r>
-        <w:t xml:space="preserve"> consulta por día, con y sin reservas, y detalle por id existente (200) e inexistente (404) (4 pruebas).</w:t>
+        <w:t xml:space="preserve"> consulta por fecha, con/sin reservas, y detalle por ID existente (200) e inexistente (404) (4 pruebas).</w:t>
       </w:r>
     </w:p>
     <w:p>
       <w:pPr>
         <w:pStyle w:val="ListBullet"/>
-        <w:spacing w:after="50" w:line="276" w:lineRule="auto"/>
+        <w:spacing w:before="0" w:after="30" w:line="276" w:lineRule="auto"/>
       </w:pPr>
       <w:r>
         <w:rPr>
@@ -206,12 +555,7 @@
         <w:t>CRUD de reservas:</w:t>
       </w:r>
       <w:r>
-        <w:t xml:space="preserve"> creación persistida, rechazo por colisión de fechas y cancelación (4 pruebas).</w:t>
-      </w:r>
-    </w:p>
-    <w:p>
-      <w:r>
-        <w:br w:type="page"/>
+        <w:t xml:space="preserve"> persistencia de reservas, prevención de colisiones de fechas y cancelación (4 pruebas).</w:t>
       </w:r>
     </w:p>
     <w:p>
@@ -224,14 +568,14 @@
     </w:p>
     <w:p>
       <w:pPr>
-        <w:spacing w:after="120" w:line="276" w:lineRule="auto"/>
+        <w:spacing w:before="0" w:after="60" w:line="276" w:lineRule="auto"/>
       </w:pPr>
       <w:r>
         <w:rPr>
           <w:b w:val="0"/>
           <w:i w:val="0"/>
         </w:rPr>
-        <w:t>Comprueban que el sistema cumple los criterios de aceptación de las Historias de Usuario. Se declararon 8 casos (TC-01 a TC-08) en Azure Test Plans (Test Suite #1055, casos #1046 a #1053), automatizados en el proyecto SistemaReservaHotel.Tests:</w:t>
+        <w:t>Comprueban que el sistema cumple con los criterios de aceptación funcionales de las Historias de Usuario. Se declararon 8 casos (TC-01 a TC-08) gestionados en Azure Test Plans (Test Suite #1055, casos #1046 a #1053) y automatizados en el proyecto SistemaReservaHotel.Tests:</w:t>
       </w:r>
     </w:p>
     <w:tbl>
@@ -242,27 +586,27 @@
         <w:tblLook w:firstColumn="1" w:firstRow="1" w:lastColumn="0" w:lastRow="0" w:noHBand="0" w:noVBand="1" w:val="04A0"/>
       </w:tblPr>
       <w:tblGrid>
-        <w:gridCol w:w="2340"/>
-        <w:gridCol w:w="2340"/>
-        <w:gridCol w:w="2340"/>
-        <w:gridCol w:w="2340"/>
+        <w:gridCol w:w="2412"/>
+        <w:gridCol w:w="2412"/>
+        <w:gridCol w:w="2412"/>
+        <w:gridCol w:w="2412"/>
       </w:tblGrid>
       <w:tr>
         <w:trPr>
-          <w:trHeight w:val="460" w:hRule="atLeast"/>
+          <w:trHeight w:val="360" w:hRule="atLeast"/>
           <w:tblHeader/>
           <w:cantSplit/>
         </w:trPr>
         <w:tc>
           <w:tcPr>
-            <w:tcW w:type="dxa" w:w="1152"/>
+            <w:tcW w:type="dxa" w:w="1080"/>
             <w:shd w:fill="1F3A5F"/>
             <w:vAlign w:val="center"/>
             <w:tcMar>
-              <w:top w:w="100" w:type="dxa"/>
-              <w:bottom w:w="100" w:type="dxa"/>
-              <w:left w:w="160" w:type="dxa"/>
-              <w:right w:w="160" w:type="dxa"/>
+              <w:top w:w="70" w:type="dxa"/>
+              <w:bottom w:w="70" w:type="dxa"/>
+              <w:left w:w="100" w:type="dxa"/>
+              <w:right w:w="100" w:type="dxa"/>
             </w:tcMar>
           </w:tcPr>
           <w:p>
@@ -274,7 +618,7 @@
               <w:rPr>
                 <w:b/>
                 <w:color w:val="FFFFFF"/>
-                <w:sz w:val="19"/>
+                <w:sz w:val="18"/>
               </w:rPr>
               <w:t>Caso</w:t>
             </w:r>
@@ -282,14 +626,14 @@
         </w:tc>
         <w:tc>
           <w:tcPr>
-            <w:tcW w:type="dxa" w:w="1368"/>
+            <w:tcW w:type="dxa" w:w="1296"/>
             <w:shd w:fill="1F3A5F"/>
             <w:vAlign w:val="center"/>
             <w:tcMar>
-              <w:top w:w="100" w:type="dxa"/>
-              <w:bottom w:w="100" w:type="dxa"/>
-              <w:left w:w="160" w:type="dxa"/>
-              <w:right w:w="160" w:type="dxa"/>
+              <w:top w:w="70" w:type="dxa"/>
+              <w:bottom w:w="70" w:type="dxa"/>
+              <w:left w:w="100" w:type="dxa"/>
+              <w:right w:w="100" w:type="dxa"/>
             </w:tcMar>
           </w:tcPr>
           <w:p>
@@ -301,7 +645,7 @@
               <w:rPr>
                 <w:b/>
                 <w:color w:val="FFFFFF"/>
-                <w:sz w:val="19"/>
+                <w:sz w:val="18"/>
               </w:rPr>
               <w:t>ID Azure</w:t>
             </w:r>
@@ -309,14 +653,14 @@
         </w:tc>
         <w:tc>
           <w:tcPr>
-            <w:tcW w:type="dxa" w:w="4824"/>
+            <w:tcW w:type="dxa" w:w="5256"/>
             <w:shd w:fill="1F3A5F"/>
             <w:vAlign w:val="center"/>
             <w:tcMar>
-              <w:top w:w="100" w:type="dxa"/>
-              <w:bottom w:w="100" w:type="dxa"/>
-              <w:left w:w="160" w:type="dxa"/>
-              <w:right w:w="160" w:type="dxa"/>
+              <w:top w:w="70" w:type="dxa"/>
+              <w:bottom w:w="70" w:type="dxa"/>
+              <w:left w:w="100" w:type="dxa"/>
+              <w:right w:w="100" w:type="dxa"/>
             </w:tcMar>
           </w:tcPr>
           <w:p>
@@ -328,7 +672,7 @@
               <w:rPr>
                 <w:b/>
                 <w:color w:val="FFFFFF"/>
-                <w:sz w:val="19"/>
+                <w:sz w:val="18"/>
               </w:rPr>
               <w:t>Criterio de aceptación</w:t>
             </w:r>
@@ -340,10 +684,10 @@
             <w:shd w:fill="1F3A5F"/>
             <w:vAlign w:val="center"/>
             <w:tcMar>
-              <w:top w:w="100" w:type="dxa"/>
-              <w:bottom w:w="100" w:type="dxa"/>
-              <w:left w:w="160" w:type="dxa"/>
-              <w:right w:w="160" w:type="dxa"/>
+              <w:top w:w="70" w:type="dxa"/>
+              <w:bottom w:w="70" w:type="dxa"/>
+              <w:left w:w="100" w:type="dxa"/>
+              <w:right w:w="100" w:type="dxa"/>
             </w:tcMar>
           </w:tcPr>
           <w:p>
@@ -355,7 +699,7 @@
               <w:rPr>
                 <w:b/>
                 <w:color w:val="FFFFFF"/>
-                <w:sz w:val="19"/>
+                <w:sz w:val="18"/>
               </w:rPr>
               <w:t>Responsable</w:t>
             </w:r>
@@ -364,30 +708,30 @@
       </w:tr>
       <w:tr>
         <w:trPr>
-          <w:trHeight w:val="440" w:hRule="atLeast"/>
+          <w:trHeight w:val="320" w:hRule="atLeast"/>
           <w:cantSplit/>
         </w:trPr>
         <w:tc>
           <w:tcPr>
-            <w:tcW w:type="dxa" w:w="1152"/>
+            <w:tcW w:type="dxa" w:w="1080"/>
             <w:shd w:fill="FFFFFF"/>
             <w:vAlign w:val="center"/>
             <w:tcMar>
-              <w:top w:w="100" w:type="dxa"/>
-              <w:bottom w:w="100" w:type="dxa"/>
-              <w:left w:w="160" w:type="dxa"/>
-              <w:right w:w="160" w:type="dxa"/>
+              <w:top w:w="50" w:type="dxa"/>
+              <w:bottom w:w="50" w:type="dxa"/>
+              <w:left w:w="100" w:type="dxa"/>
+              <w:right w:w="100" w:type="dxa"/>
             </w:tcMar>
           </w:tcPr>
           <w:p>
             <w:pPr>
-              <w:spacing w:before="0" w:after="0" w:line="276" w:lineRule="auto"/>
+              <w:spacing w:before="0" w:after="0" w:line="264" w:lineRule="auto"/>
               <w:jc w:val="center"/>
             </w:pPr>
             <w:r>
               <w:rPr>
                 <w:b/>
-                <w:sz w:val="19"/>
+                <w:sz w:val="17"/>
               </w:rPr>
               <w:t>TC-01</w:t>
             </w:r>
@@ -395,24 +739,24 @@
         </w:tc>
         <w:tc>
           <w:tcPr>
-            <w:tcW w:type="dxa" w:w="1368"/>
+            <w:tcW w:type="dxa" w:w="1296"/>
             <w:shd w:fill="FFFFFF"/>
             <w:vAlign w:val="center"/>
             <w:tcMar>
-              <w:top w:w="100" w:type="dxa"/>
-              <w:bottom w:w="100" w:type="dxa"/>
-              <w:left w:w="160" w:type="dxa"/>
-              <w:right w:w="160" w:type="dxa"/>
+              <w:top w:w="50" w:type="dxa"/>
+              <w:bottom w:w="50" w:type="dxa"/>
+              <w:left w:w="100" w:type="dxa"/>
+              <w:right w:w="100" w:type="dxa"/>
             </w:tcMar>
           </w:tcPr>
           <w:p>
             <w:pPr>
-              <w:spacing w:before="0" w:after="0" w:line="276" w:lineRule="auto"/>
+              <w:spacing w:before="0" w:after="0" w:line="264" w:lineRule="auto"/>
               <w:jc w:val="center"/>
             </w:pPr>
             <w:r>
               <w:rPr>
-                <w:sz w:val="19"/>
+                <w:sz w:val="17"/>
               </w:rPr>
               <w:t>#1046</w:t>
             </w:r>
@@ -420,23 +764,23 @@
         </w:tc>
         <w:tc>
           <w:tcPr>
-            <w:tcW w:type="dxa" w:w="4824"/>
+            <w:tcW w:type="dxa" w:w="5256"/>
             <w:shd w:fill="FFFFFF"/>
             <w:vAlign w:val="center"/>
             <w:tcMar>
-              <w:top w:w="100" w:type="dxa"/>
-              <w:bottom w:w="100" w:type="dxa"/>
-              <w:left w:w="160" w:type="dxa"/>
-              <w:right w:w="160" w:type="dxa"/>
+              <w:top w:w="50" w:type="dxa"/>
+              <w:bottom w:w="50" w:type="dxa"/>
+              <w:left w:w="100" w:type="dxa"/>
+              <w:right w:w="100" w:type="dxa"/>
             </w:tcMar>
           </w:tcPr>
           <w:p>
             <w:pPr>
-              <w:spacing w:before="0" w:after="0" w:line="276" w:lineRule="auto"/>
+              <w:spacing w:before="0" w:after="0" w:line="264" w:lineRule="auto"/>
             </w:pPr>
             <w:r>
               <w:rPr>
-                <w:sz w:val="19"/>
+                <w:sz w:val="17"/>
               </w:rPr>
               <w:t>Filtrar reservas por fecha y verificar el cálculo automático de noches</w:t>
             </w:r>
@@ -448,19 +792,19 @@
             <w:shd w:fill="FFFFFF"/>
             <w:vAlign w:val="center"/>
             <w:tcMar>
-              <w:top w:w="100" w:type="dxa"/>
-              <w:bottom w:w="100" w:type="dxa"/>
-              <w:left w:w="160" w:type="dxa"/>
-              <w:right w:w="160" w:type="dxa"/>
+              <w:top w:w="50" w:type="dxa"/>
+              <w:bottom w:w="50" w:type="dxa"/>
+              <w:left w:w="100" w:type="dxa"/>
+              <w:right w:w="100" w:type="dxa"/>
             </w:tcMar>
           </w:tcPr>
           <w:p>
             <w:pPr>
-              <w:spacing w:before="0" w:after="0" w:line="276" w:lineRule="auto"/>
+              <w:spacing w:before="0" w:after="0" w:line="264" w:lineRule="auto"/>
             </w:pPr>
             <w:r>
               <w:rPr>
-                <w:sz w:val="19"/>
+                <w:sz w:val="17"/>
               </w:rPr>
               <w:t>Ariel Ascencio</w:t>
             </w:r>
@@ -469,30 +813,30 @@
       </w:tr>
       <w:tr>
         <w:trPr>
-          <w:trHeight w:val="440" w:hRule="atLeast"/>
+          <w:trHeight w:val="320" w:hRule="atLeast"/>
           <w:cantSplit/>
         </w:trPr>
         <w:tc>
           <w:tcPr>
-            <w:tcW w:type="dxa" w:w="1152"/>
+            <w:tcW w:type="dxa" w:w="1080"/>
             <w:shd w:fill="F2F5F9"/>
             <w:vAlign w:val="center"/>
             <w:tcMar>
-              <w:top w:w="100" w:type="dxa"/>
-              <w:bottom w:w="100" w:type="dxa"/>
-              <w:left w:w="160" w:type="dxa"/>
-              <w:right w:w="160" w:type="dxa"/>
+              <w:top w:w="50" w:type="dxa"/>
+              <w:bottom w:w="50" w:type="dxa"/>
+              <w:left w:w="100" w:type="dxa"/>
+              <w:right w:w="100" w:type="dxa"/>
             </w:tcMar>
           </w:tcPr>
           <w:p>
             <w:pPr>
-              <w:spacing w:before="0" w:after="0" w:line="276" w:lineRule="auto"/>
+              <w:spacing w:before="0" w:after="0" w:line="264" w:lineRule="auto"/>
               <w:jc w:val="center"/>
             </w:pPr>
             <w:r>
               <w:rPr>
                 <w:b/>
-                <w:sz w:val="19"/>
+                <w:sz w:val="17"/>
               </w:rPr>
               <w:t>TC-02</w:t>
             </w:r>
@@ -500,24 +844,24 @@
         </w:tc>
         <w:tc>
           <w:tcPr>
-            <w:tcW w:type="dxa" w:w="1368"/>
+            <w:tcW w:type="dxa" w:w="1296"/>
             <w:shd w:fill="F2F5F9"/>
             <w:vAlign w:val="center"/>
             <w:tcMar>
-              <w:top w:w="100" w:type="dxa"/>
-              <w:bottom w:w="100" w:type="dxa"/>
-              <w:left w:w="160" w:type="dxa"/>
-              <w:right w:w="160" w:type="dxa"/>
+              <w:top w:w="50" w:type="dxa"/>
+              <w:bottom w:w="50" w:type="dxa"/>
+              <w:left w:w="100" w:type="dxa"/>
+              <w:right w:w="100" w:type="dxa"/>
             </w:tcMar>
           </w:tcPr>
           <w:p>
             <w:pPr>
-              <w:spacing w:before="0" w:after="0" w:line="276" w:lineRule="auto"/>
+              <w:spacing w:before="0" w:after="0" w:line="264" w:lineRule="auto"/>
               <w:jc w:val="center"/>
             </w:pPr>
             <w:r>
               <w:rPr>
-                <w:sz w:val="19"/>
+                <w:sz w:val="17"/>
               </w:rPr>
               <w:t>#1047</w:t>
             </w:r>
@@ -525,23 +869,23 @@
         </w:tc>
         <w:tc>
           <w:tcPr>
-            <w:tcW w:type="dxa" w:w="4824"/>
+            <w:tcW w:type="dxa" w:w="5256"/>
             <w:shd w:fill="F2F5F9"/>
             <w:vAlign w:val="center"/>
             <w:tcMar>
-              <w:top w:w="100" w:type="dxa"/>
-              <w:bottom w:w="100" w:type="dxa"/>
-              <w:left w:w="160" w:type="dxa"/>
-              <w:right w:w="160" w:type="dxa"/>
+              <w:top w:w="50" w:type="dxa"/>
+              <w:bottom w:w="50" w:type="dxa"/>
+              <w:left w:w="100" w:type="dxa"/>
+              <w:right w:w="100" w:type="dxa"/>
             </w:tcMar>
           </w:tcPr>
           <w:p>
             <w:pPr>
-              <w:spacing w:before="0" w:after="0" w:line="276" w:lineRule="auto"/>
+              <w:spacing w:before="0" w:after="0" w:line="264" w:lineRule="auto"/>
             </w:pPr>
             <w:r>
               <w:rPr>
-                <w:sz w:val="19"/>
+                <w:sz w:val="17"/>
               </w:rPr>
               <w:t>Respuesta HTTP 200 en GET /ReservasAdmin/PorFecha</w:t>
             </w:r>
@@ -553,19 +897,19 @@
             <w:shd w:fill="F2F5F9"/>
             <w:vAlign w:val="center"/>
             <w:tcMar>
-              <w:top w:w="100" w:type="dxa"/>
-              <w:bottom w:w="100" w:type="dxa"/>
-              <w:left w:w="160" w:type="dxa"/>
-              <w:right w:w="160" w:type="dxa"/>
+              <w:top w:w="50" w:type="dxa"/>
+              <w:bottom w:w="50" w:type="dxa"/>
+              <w:left w:w="100" w:type="dxa"/>
+              <w:right w:w="100" w:type="dxa"/>
             </w:tcMar>
           </w:tcPr>
           <w:p>
             <w:pPr>
-              <w:spacing w:before="0" w:after="0" w:line="276" w:lineRule="auto"/>
+              <w:spacing w:before="0" w:after="0" w:line="264" w:lineRule="auto"/>
             </w:pPr>
             <w:r>
               <w:rPr>
-                <w:sz w:val="19"/>
+                <w:sz w:val="17"/>
               </w:rPr>
               <w:t>Carlos Miranda</w:t>
             </w:r>
@@ -574,30 +918,30 @@
       </w:tr>
       <w:tr>
         <w:trPr>
-          <w:trHeight w:val="440" w:hRule="atLeast"/>
+          <w:trHeight w:val="320" w:hRule="atLeast"/>
           <w:cantSplit/>
         </w:trPr>
         <w:tc>
           <w:tcPr>
-            <w:tcW w:type="dxa" w:w="1152"/>
+            <w:tcW w:type="dxa" w:w="1080"/>
             <w:shd w:fill="FFFFFF"/>
             <w:vAlign w:val="center"/>
             <w:tcMar>
-              <w:top w:w="100" w:type="dxa"/>
-              <w:bottom w:w="100" w:type="dxa"/>
-              <w:left w:w="160" w:type="dxa"/>
-              <w:right w:w="160" w:type="dxa"/>
+              <w:top w:w="50" w:type="dxa"/>
+              <w:bottom w:w="50" w:type="dxa"/>
+              <w:left w:w="100" w:type="dxa"/>
+              <w:right w:w="100" w:type="dxa"/>
             </w:tcMar>
           </w:tcPr>
           <w:p>
             <w:pPr>
-              <w:spacing w:before="0" w:after="0" w:line="276" w:lineRule="auto"/>
+              <w:spacing w:before="0" w:after="0" w:line="264" w:lineRule="auto"/>
               <w:jc w:val="center"/>
             </w:pPr>
             <w:r>
               <w:rPr>
                 <w:b/>
-                <w:sz w:val="19"/>
+                <w:sz w:val="17"/>
               </w:rPr>
               <w:t>TC-03</w:t>
             </w:r>
@@ -605,24 +949,24 @@
         </w:tc>
         <w:tc>
           <w:tcPr>
-            <w:tcW w:type="dxa" w:w="1368"/>
+            <w:tcW w:type="dxa" w:w="1296"/>
             <w:shd w:fill="FFFFFF"/>
             <w:vAlign w:val="center"/>
             <w:tcMar>
-              <w:top w:w="100" w:type="dxa"/>
-              <w:bottom w:w="100" w:type="dxa"/>
-              <w:left w:w="160" w:type="dxa"/>
-              <w:right w:w="160" w:type="dxa"/>
+              <w:top w:w="50" w:type="dxa"/>
+              <w:bottom w:w="50" w:type="dxa"/>
+              <w:left w:w="100" w:type="dxa"/>
+              <w:right w:w="100" w:type="dxa"/>
             </w:tcMar>
           </w:tcPr>
           <w:p>
             <w:pPr>
-              <w:spacing w:before="0" w:after="0" w:line="276" w:lineRule="auto"/>
+              <w:spacing w:before="0" w:after="0" w:line="264" w:lineRule="auto"/>
               <w:jc w:val="center"/>
             </w:pPr>
             <w:r>
               <w:rPr>
-                <w:sz w:val="19"/>
+                <w:sz w:val="17"/>
               </w:rPr>
               <w:t>#1048</w:t>
             </w:r>
@@ -630,23 +974,23 @@
         </w:tc>
         <w:tc>
           <w:tcPr>
-            <w:tcW w:type="dxa" w:w="4824"/>
+            <w:tcW w:type="dxa" w:w="5256"/>
             <w:shd w:fill="FFFFFF"/>
             <w:vAlign w:val="center"/>
             <w:tcMar>
-              <w:top w:w="100" w:type="dxa"/>
-              <w:bottom w:w="100" w:type="dxa"/>
-              <w:left w:w="160" w:type="dxa"/>
-              <w:right w:w="160" w:type="dxa"/>
+              <w:top w:w="50" w:type="dxa"/>
+              <w:bottom w:w="50" w:type="dxa"/>
+              <w:left w:w="100" w:type="dxa"/>
+              <w:right w:w="100" w:type="dxa"/>
             </w:tcMar>
           </w:tcPr>
           <w:p>
             <w:pPr>
-              <w:spacing w:before="0" w:after="0" w:line="276" w:lineRule="auto"/>
+              <w:spacing w:before="0" w:after="0" w:line="264" w:lineRule="auto"/>
             </w:pPr>
             <w:r>
               <w:rPr>
-                <w:sz w:val="19"/>
+                <w:sz w:val="17"/>
               </w:rPr>
               <w:t>Filtrar reporte por rango de fechas y validar la sumatoria de facturación</w:t>
             </w:r>
@@ -658,19 +1002,19 @@
             <w:shd w:fill="FFFFFF"/>
             <w:vAlign w:val="center"/>
             <w:tcMar>
-              <w:top w:w="100" w:type="dxa"/>
-              <w:bottom w:w="100" w:type="dxa"/>
-              <w:left w:w="160" w:type="dxa"/>
-              <w:right w:w="160" w:type="dxa"/>
+              <w:top w:w="50" w:type="dxa"/>
+              <w:bottom w:w="50" w:type="dxa"/>
+              <w:left w:w="100" w:type="dxa"/>
+              <w:right w:w="100" w:type="dxa"/>
             </w:tcMar>
           </w:tcPr>
           <w:p>
             <w:pPr>
-              <w:spacing w:before="0" w:after="0" w:line="276" w:lineRule="auto"/>
+              <w:spacing w:before="0" w:after="0" w:line="264" w:lineRule="auto"/>
             </w:pPr>
             <w:r>
               <w:rPr>
-                <w:sz w:val="19"/>
+                <w:sz w:val="17"/>
               </w:rPr>
               <w:t>Camila Calderón</w:t>
             </w:r>
@@ -679,30 +1023,30 @@
       </w:tr>
       <w:tr>
         <w:trPr>
-          <w:trHeight w:val="440" w:hRule="atLeast"/>
+          <w:trHeight w:val="320" w:hRule="atLeast"/>
           <w:cantSplit/>
         </w:trPr>
         <w:tc>
           <w:tcPr>
-            <w:tcW w:type="dxa" w:w="1152"/>
+            <w:tcW w:type="dxa" w:w="1080"/>
             <w:shd w:fill="F2F5F9"/>
             <w:vAlign w:val="center"/>
             <w:tcMar>
-              <w:top w:w="100" w:type="dxa"/>
-              <w:bottom w:w="100" w:type="dxa"/>
-              <w:left w:w="160" w:type="dxa"/>
-              <w:right w:w="160" w:type="dxa"/>
+              <w:top w:w="50" w:type="dxa"/>
+              <w:bottom w:w="50" w:type="dxa"/>
+              <w:left w:w="100" w:type="dxa"/>
+              <w:right w:w="100" w:type="dxa"/>
             </w:tcMar>
           </w:tcPr>
           <w:p>
             <w:pPr>
-              <w:spacing w:before="0" w:after="0" w:line="276" w:lineRule="auto"/>
+              <w:spacing w:before="0" w:after="0" w:line="264" w:lineRule="auto"/>
               <w:jc w:val="center"/>
             </w:pPr>
             <w:r>
               <w:rPr>
                 <w:b/>
-                <w:sz w:val="19"/>
+                <w:sz w:val="17"/>
               </w:rPr>
               <w:t>TC-04</w:t>
             </w:r>
@@ -710,24 +1054,24 @@
         </w:tc>
         <w:tc>
           <w:tcPr>
-            <w:tcW w:type="dxa" w:w="1368"/>
+            <w:tcW w:type="dxa" w:w="1296"/>
             <w:shd w:fill="F2F5F9"/>
             <w:vAlign w:val="center"/>
             <w:tcMar>
-              <w:top w:w="100" w:type="dxa"/>
-              <w:bottom w:w="100" w:type="dxa"/>
-              <w:left w:w="160" w:type="dxa"/>
-              <w:right w:w="160" w:type="dxa"/>
+              <w:top w:w="50" w:type="dxa"/>
+              <w:bottom w:w="50" w:type="dxa"/>
+              <w:left w:w="100" w:type="dxa"/>
+              <w:right w:w="100" w:type="dxa"/>
             </w:tcMar>
           </w:tcPr>
           <w:p>
             <w:pPr>
-              <w:spacing w:before="0" w:after="0" w:line="276" w:lineRule="auto"/>
+              <w:spacing w:before="0" w:after="0" w:line="264" w:lineRule="auto"/>
               <w:jc w:val="center"/>
             </w:pPr>
             <w:r>
               <w:rPr>
-                <w:sz w:val="19"/>
+                <w:sz w:val="17"/>
               </w:rPr>
               <w:t>#1049</w:t>
             </w:r>
@@ -735,23 +1079,23 @@
         </w:tc>
         <w:tc>
           <w:tcPr>
-            <w:tcW w:type="dxa" w:w="4824"/>
+            <w:tcW w:type="dxa" w:w="5256"/>
             <w:shd w:fill="F2F5F9"/>
             <w:vAlign w:val="center"/>
             <w:tcMar>
-              <w:top w:w="100" w:type="dxa"/>
-              <w:bottom w:w="100" w:type="dxa"/>
-              <w:left w:w="160" w:type="dxa"/>
-              <w:right w:w="160" w:type="dxa"/>
+              <w:top w:w="50" w:type="dxa"/>
+              <w:bottom w:w="50" w:type="dxa"/>
+              <w:left w:w="100" w:type="dxa"/>
+              <w:right w:w="100" w:type="dxa"/>
             </w:tcMar>
           </w:tcPr>
           <w:p>
             <w:pPr>
-              <w:spacing w:before="0" w:after="0" w:line="276" w:lineRule="auto"/>
+              <w:spacing w:before="0" w:after="0" w:line="264" w:lineRule="auto"/>
             </w:pPr>
             <w:r>
               <w:rPr>
-                <w:sz w:val="19"/>
+                <w:sz w:val="17"/>
               </w:rPr>
               <w:t>Respuesta HTTP 200 en GET /Reportes/Reservas</w:t>
             </w:r>
@@ -763,19 +1107,19 @@
             <w:shd w:fill="F2F5F9"/>
             <w:vAlign w:val="center"/>
             <w:tcMar>
-              <w:top w:w="100" w:type="dxa"/>
-              <w:bottom w:w="100" w:type="dxa"/>
-              <w:left w:w="160" w:type="dxa"/>
-              <w:right w:w="160" w:type="dxa"/>
+              <w:top w:w="50" w:type="dxa"/>
+              <w:bottom w:w="50" w:type="dxa"/>
+              <w:left w:w="100" w:type="dxa"/>
+              <w:right w:w="100" w:type="dxa"/>
             </w:tcMar>
           </w:tcPr>
           <w:p>
             <w:pPr>
-              <w:spacing w:before="0" w:after="0" w:line="276" w:lineRule="auto"/>
+              <w:spacing w:before="0" w:after="0" w:line="264" w:lineRule="auto"/>
             </w:pPr>
             <w:r>
               <w:rPr>
-                <w:sz w:val="19"/>
+                <w:sz w:val="17"/>
               </w:rPr>
               <w:t>Joselin Herrera</w:t>
             </w:r>
@@ -784,30 +1128,30 @@
       </w:tr>
       <w:tr>
         <w:trPr>
-          <w:trHeight w:val="440" w:hRule="atLeast"/>
+          <w:trHeight w:val="320" w:hRule="atLeast"/>
           <w:cantSplit/>
         </w:trPr>
         <w:tc>
           <w:tcPr>
-            <w:tcW w:type="dxa" w:w="1152"/>
+            <w:tcW w:type="dxa" w:w="1080"/>
             <w:shd w:fill="FFFFFF"/>
             <w:vAlign w:val="center"/>
             <w:tcMar>
-              <w:top w:w="100" w:type="dxa"/>
-              <w:bottom w:w="100" w:type="dxa"/>
-              <w:left w:w="160" w:type="dxa"/>
-              <w:right w:w="160" w:type="dxa"/>
+              <w:top w:w="50" w:type="dxa"/>
+              <w:bottom w:w="50" w:type="dxa"/>
+              <w:left w:w="100" w:type="dxa"/>
+              <w:right w:w="100" w:type="dxa"/>
             </w:tcMar>
           </w:tcPr>
           <w:p>
             <w:pPr>
-              <w:spacing w:before="0" w:after="0" w:line="276" w:lineRule="auto"/>
+              <w:spacing w:before="0" w:after="0" w:line="264" w:lineRule="auto"/>
               <w:jc w:val="center"/>
             </w:pPr>
             <w:r>
               <w:rPr>
                 <w:b/>
-                <w:sz w:val="19"/>
+                <w:sz w:val="17"/>
               </w:rPr>
               <w:t>TC-05</w:t>
             </w:r>
@@ -815,24 +1159,24 @@
         </w:tc>
         <w:tc>
           <w:tcPr>
-            <w:tcW w:type="dxa" w:w="1368"/>
+            <w:tcW w:type="dxa" w:w="1296"/>
             <w:shd w:fill="FFFFFF"/>
             <w:vAlign w:val="center"/>
             <w:tcMar>
-              <w:top w:w="100" w:type="dxa"/>
-              <w:bottom w:w="100" w:type="dxa"/>
-              <w:left w:w="160" w:type="dxa"/>
-              <w:right w:w="160" w:type="dxa"/>
+              <w:top w:w="50" w:type="dxa"/>
+              <w:bottom w:w="50" w:type="dxa"/>
+              <w:left w:w="100" w:type="dxa"/>
+              <w:right w:w="100" w:type="dxa"/>
             </w:tcMar>
           </w:tcPr>
           <w:p>
             <w:pPr>
-              <w:spacing w:before="0" w:after="0" w:line="276" w:lineRule="auto"/>
+              <w:spacing w:before="0" w:after="0" w:line="264" w:lineRule="auto"/>
               <w:jc w:val="center"/>
             </w:pPr>
             <w:r>
               <w:rPr>
-                <w:sz w:val="19"/>
+                <w:sz w:val="17"/>
               </w:rPr>
               <w:t>#1050</w:t>
             </w:r>
@@ -840,23 +1184,23 @@
         </w:tc>
         <w:tc>
           <w:tcPr>
-            <w:tcW w:type="dxa" w:w="4824"/>
+            <w:tcW w:type="dxa" w:w="5256"/>
             <w:shd w:fill="FFFFFF"/>
             <w:vAlign w:val="center"/>
             <w:tcMar>
-              <w:top w:w="100" w:type="dxa"/>
-              <w:bottom w:w="100" w:type="dxa"/>
-              <w:left w:w="160" w:type="dxa"/>
-              <w:right w:w="160" w:type="dxa"/>
+              <w:top w:w="50" w:type="dxa"/>
+              <w:bottom w:w="50" w:type="dxa"/>
+              <w:left w:w="100" w:type="dxa"/>
+              <w:right w:w="100" w:type="dxa"/>
             </w:tcMar>
           </w:tcPr>
           <w:p>
             <w:pPr>
-              <w:spacing w:before="0" w:after="0" w:line="276" w:lineRule="auto"/>
+              <w:spacing w:before="0" w:after="0" w:line="264" w:lineRule="auto"/>
             </w:pPr>
             <w:r>
               <w:rPr>
-                <w:sz w:val="19"/>
+                <w:sz w:val="17"/>
               </w:rPr>
               <w:t>Anticolisión en DisponibilidadService ante fechas solapadas</w:t>
             </w:r>
@@ -868,19 +1212,19 @@
             <w:shd w:fill="FFFFFF"/>
             <w:vAlign w:val="center"/>
             <w:tcMar>
-              <w:top w:w="100" w:type="dxa"/>
-              <w:bottom w:w="100" w:type="dxa"/>
-              <w:left w:w="160" w:type="dxa"/>
-              <w:right w:w="160" w:type="dxa"/>
+              <w:top w:w="50" w:type="dxa"/>
+              <w:bottom w:w="50" w:type="dxa"/>
+              <w:left w:w="100" w:type="dxa"/>
+              <w:right w:w="100" w:type="dxa"/>
             </w:tcMar>
           </w:tcPr>
           <w:p>
             <w:pPr>
-              <w:spacing w:before="0" w:after="0" w:line="276" w:lineRule="auto"/>
+              <w:spacing w:before="0" w:after="0" w:line="264" w:lineRule="auto"/>
             </w:pPr>
             <w:r>
               <w:rPr>
-                <w:sz w:val="19"/>
+                <w:sz w:val="17"/>
               </w:rPr>
               <w:t>Joselin Herrera</w:t>
             </w:r>
@@ -889,30 +1233,30 @@
       </w:tr>
       <w:tr>
         <w:trPr>
-          <w:trHeight w:val="440" w:hRule="atLeast"/>
+          <w:trHeight w:val="320" w:hRule="atLeast"/>
           <w:cantSplit/>
         </w:trPr>
         <w:tc>
           <w:tcPr>
-            <w:tcW w:type="dxa" w:w="1152"/>
+            <w:tcW w:type="dxa" w:w="1080"/>
             <w:shd w:fill="F2F5F9"/>
             <w:vAlign w:val="center"/>
             <w:tcMar>
-              <w:top w:w="100" w:type="dxa"/>
-              <w:bottom w:w="100" w:type="dxa"/>
-              <w:left w:w="160" w:type="dxa"/>
-              <w:right w:w="160" w:type="dxa"/>
+              <w:top w:w="50" w:type="dxa"/>
+              <w:bottom w:w="50" w:type="dxa"/>
+              <w:left w:w="100" w:type="dxa"/>
+              <w:right w:w="100" w:type="dxa"/>
             </w:tcMar>
           </w:tcPr>
           <w:p>
             <w:pPr>
-              <w:spacing w:before="0" w:after="0" w:line="276" w:lineRule="auto"/>
+              <w:spacing w:before="0" w:after="0" w:line="264" w:lineRule="auto"/>
               <w:jc w:val="center"/>
             </w:pPr>
             <w:r>
               <w:rPr>
                 <w:b/>
-                <w:sz w:val="19"/>
+                <w:sz w:val="17"/>
               </w:rPr>
               <w:t>TC-06</w:t>
             </w:r>
@@ -920,24 +1264,24 @@
         </w:tc>
         <w:tc>
           <w:tcPr>
-            <w:tcW w:type="dxa" w:w="1368"/>
+            <w:tcW w:type="dxa" w:w="1296"/>
             <w:shd w:fill="F2F5F9"/>
             <w:vAlign w:val="center"/>
             <w:tcMar>
-              <w:top w:w="100" w:type="dxa"/>
-              <w:bottom w:w="100" w:type="dxa"/>
-              <w:left w:w="160" w:type="dxa"/>
-              <w:right w:w="160" w:type="dxa"/>
+              <w:top w:w="50" w:type="dxa"/>
+              <w:bottom w:w="50" w:type="dxa"/>
+              <w:left w:w="100" w:type="dxa"/>
+              <w:right w:w="100" w:type="dxa"/>
             </w:tcMar>
           </w:tcPr>
           <w:p>
             <w:pPr>
-              <w:spacing w:before="0" w:after="0" w:line="276" w:lineRule="auto"/>
+              <w:spacing w:before="0" w:after="0" w:line="264" w:lineRule="auto"/>
               <w:jc w:val="center"/>
             </w:pPr>
             <w:r>
               <w:rPr>
-                <w:sz w:val="19"/>
+                <w:sz w:val="17"/>
               </w:rPr>
               <w:t>#1051</w:t>
             </w:r>
@@ -945,23 +1289,23 @@
         </w:tc>
         <w:tc>
           <w:tcPr>
-            <w:tcW w:type="dxa" w:w="4824"/>
+            <w:tcW w:type="dxa" w:w="5256"/>
             <w:shd w:fill="F2F5F9"/>
             <w:vAlign w:val="center"/>
             <w:tcMar>
-              <w:top w:w="100" w:type="dxa"/>
-              <w:bottom w:w="100" w:type="dxa"/>
-              <w:left w:w="160" w:type="dxa"/>
-              <w:right w:w="160" w:type="dxa"/>
+              <w:top w:w="50" w:type="dxa"/>
+              <w:bottom w:w="50" w:type="dxa"/>
+              <w:left w:w="100" w:type="dxa"/>
+              <w:right w:w="100" w:type="dxa"/>
             </w:tcMar>
           </w:tcPr>
           <w:p>
             <w:pPr>
-              <w:spacing w:before="0" w:after="0" w:line="276" w:lineRule="auto"/>
+              <w:spacing w:before="0" w:after="0" w:line="264" w:lineRule="auto"/>
             </w:pPr>
             <w:r>
               <w:rPr>
-                <w:sz w:val="19"/>
+                <w:sz w:val="17"/>
               </w:rPr>
               <w:t>Cálculo de tarifa por temporada alta (3 noches x $120.00 = $360.00)</w:t>
             </w:r>
@@ -973,19 +1317,19 @@
             <w:shd w:fill="F2F5F9"/>
             <w:vAlign w:val="center"/>
             <w:tcMar>
-              <w:top w:w="100" w:type="dxa"/>
-              <w:bottom w:w="100" w:type="dxa"/>
-              <w:left w:w="160" w:type="dxa"/>
-              <w:right w:w="160" w:type="dxa"/>
+              <w:top w:w="50" w:type="dxa"/>
+              <w:bottom w:w="50" w:type="dxa"/>
+              <w:left w:w="100" w:type="dxa"/>
+              <w:right w:w="100" w:type="dxa"/>
             </w:tcMar>
           </w:tcPr>
           <w:p>
             <w:pPr>
-              <w:spacing w:before="0" w:after="0" w:line="276" w:lineRule="auto"/>
+              <w:spacing w:before="0" w:after="0" w:line="264" w:lineRule="auto"/>
             </w:pPr>
             <w:r>
               <w:rPr>
-                <w:sz w:val="19"/>
+                <w:sz w:val="17"/>
               </w:rPr>
               <w:t>Camila Calderón</w:t>
             </w:r>
@@ -994,30 +1338,30 @@
       </w:tr>
       <w:tr>
         <w:trPr>
-          <w:trHeight w:val="440" w:hRule="atLeast"/>
+          <w:trHeight w:val="320" w:hRule="atLeast"/>
           <w:cantSplit/>
         </w:trPr>
         <w:tc>
           <w:tcPr>
-            <w:tcW w:type="dxa" w:w="1152"/>
+            <w:tcW w:type="dxa" w:w="1080"/>
             <w:shd w:fill="FFFFFF"/>
             <w:vAlign w:val="center"/>
             <w:tcMar>
-              <w:top w:w="100" w:type="dxa"/>
-              <w:bottom w:w="100" w:type="dxa"/>
-              <w:left w:w="160" w:type="dxa"/>
-              <w:right w:w="160" w:type="dxa"/>
+              <w:top w:w="50" w:type="dxa"/>
+              <w:bottom w:w="50" w:type="dxa"/>
+              <w:left w:w="100" w:type="dxa"/>
+              <w:right w:w="100" w:type="dxa"/>
             </w:tcMar>
           </w:tcPr>
           <w:p>
             <w:pPr>
-              <w:spacing w:before="0" w:after="0" w:line="276" w:lineRule="auto"/>
+              <w:spacing w:before="0" w:after="0" w:line="264" w:lineRule="auto"/>
               <w:jc w:val="center"/>
             </w:pPr>
             <w:r>
               <w:rPr>
                 <w:b/>
-                <w:sz w:val="19"/>
+                <w:sz w:val="17"/>
               </w:rPr>
               <w:t>TC-07</w:t>
             </w:r>
@@ -1025,24 +1369,24 @@
         </w:tc>
         <w:tc>
           <w:tcPr>
-            <w:tcW w:type="dxa" w:w="1368"/>
+            <w:tcW w:type="dxa" w:w="1296"/>
             <w:shd w:fill="FFFFFF"/>
             <w:vAlign w:val="center"/>
             <w:tcMar>
-              <w:top w:w="100" w:type="dxa"/>
-              <w:bottom w:w="100" w:type="dxa"/>
-              <w:left w:w="160" w:type="dxa"/>
-              <w:right w:w="160" w:type="dxa"/>
+              <w:top w:w="50" w:type="dxa"/>
+              <w:bottom w:w="50" w:type="dxa"/>
+              <w:left w:w="100" w:type="dxa"/>
+              <w:right w:w="100" w:type="dxa"/>
             </w:tcMar>
           </w:tcPr>
           <w:p>
             <w:pPr>
-              <w:spacing w:before="0" w:after="0" w:line="276" w:lineRule="auto"/>
+              <w:spacing w:before="0" w:after="0" w:line="264" w:lineRule="auto"/>
               <w:jc w:val="center"/>
             </w:pPr>
             <w:r>
               <w:rPr>
-                <w:sz w:val="19"/>
+                <w:sz w:val="17"/>
               </w:rPr>
               <w:t>#1052</w:t>
             </w:r>
@@ -1050,23 +1394,23 @@
         </w:tc>
         <w:tc>
           <w:tcPr>
-            <w:tcW w:type="dxa" w:w="4824"/>
+            <w:tcW w:type="dxa" w:w="5256"/>
             <w:shd w:fill="FFFFFF"/>
             <w:vAlign w:val="center"/>
             <w:tcMar>
-              <w:top w:w="100" w:type="dxa"/>
-              <w:bottom w:w="100" w:type="dxa"/>
-              <w:left w:w="160" w:type="dxa"/>
-              <w:right w:w="160" w:type="dxa"/>
+              <w:top w:w="50" w:type="dxa"/>
+              <w:bottom w:w="50" w:type="dxa"/>
+              <w:left w:w="100" w:type="dxa"/>
+              <w:right w:w="100" w:type="dxa"/>
             </w:tcMar>
           </w:tcPr>
           <w:p>
             <w:pPr>
-              <w:spacing w:before="0" w:after="0" w:line="276" w:lineRule="auto"/>
+              <w:spacing w:before="0" w:after="0" w:line="264" w:lineRule="auto"/>
             </w:pPr>
             <w:r>
               <w:rPr>
-                <w:sz w:val="19"/>
+                <w:sz w:val="17"/>
               </w:rPr>
               <w:t>Autenticación con hash SHA-256 y emisión de cookie de sesión</w:t>
             </w:r>
@@ -1078,19 +1422,19 @@
             <w:shd w:fill="FFFFFF"/>
             <w:vAlign w:val="center"/>
             <w:tcMar>
-              <w:top w:w="100" w:type="dxa"/>
-              <w:bottom w:w="100" w:type="dxa"/>
-              <w:left w:w="160" w:type="dxa"/>
-              <w:right w:w="160" w:type="dxa"/>
+              <w:top w:w="50" w:type="dxa"/>
+              <w:bottom w:w="50" w:type="dxa"/>
+              <w:left w:w="100" w:type="dxa"/>
+              <w:right w:w="100" w:type="dxa"/>
             </w:tcMar>
           </w:tcPr>
           <w:p>
             <w:pPr>
-              <w:spacing w:before="0" w:after="0" w:line="276" w:lineRule="auto"/>
+              <w:spacing w:before="0" w:after="0" w:line="264" w:lineRule="auto"/>
             </w:pPr>
             <w:r>
               <w:rPr>
-                <w:sz w:val="19"/>
+                <w:sz w:val="17"/>
               </w:rPr>
               <w:t>Ariel Ascencio</w:t>
             </w:r>
@@ -1099,30 +1443,30 @@
       </w:tr>
       <w:tr>
         <w:trPr>
-          <w:trHeight w:val="440" w:hRule="atLeast"/>
+          <w:trHeight w:val="320" w:hRule="atLeast"/>
           <w:cantSplit/>
         </w:trPr>
         <w:tc>
           <w:tcPr>
-            <w:tcW w:type="dxa" w:w="1152"/>
+            <w:tcW w:type="dxa" w:w="1080"/>
             <w:shd w:fill="F2F5F9"/>
             <w:vAlign w:val="center"/>
             <w:tcMar>
-              <w:top w:w="100" w:type="dxa"/>
-              <w:bottom w:w="100" w:type="dxa"/>
-              <w:left w:w="160" w:type="dxa"/>
-              <w:right w:w="160" w:type="dxa"/>
+              <w:top w:w="50" w:type="dxa"/>
+              <w:bottom w:w="50" w:type="dxa"/>
+              <w:left w:w="100" w:type="dxa"/>
+              <w:right w:w="100" w:type="dxa"/>
             </w:tcMar>
           </w:tcPr>
           <w:p>
             <w:pPr>
-              <w:spacing w:before="0" w:after="0" w:line="276" w:lineRule="auto"/>
+              <w:spacing w:before="0" w:after="0" w:line="264" w:lineRule="auto"/>
               <w:jc w:val="center"/>
             </w:pPr>
             <w:r>
               <w:rPr>
                 <w:b/>
-                <w:sz w:val="19"/>
+                <w:sz w:val="17"/>
               </w:rPr>
               <w:t>TC-08</w:t>
             </w:r>
@@ -1130,24 +1474,24 @@
         </w:tc>
         <w:tc>
           <w:tcPr>
-            <w:tcW w:type="dxa" w:w="1368"/>
+            <w:tcW w:type="dxa" w:w="1296"/>
             <w:shd w:fill="F2F5F9"/>
             <w:vAlign w:val="center"/>
             <w:tcMar>
-              <w:top w:w="100" w:type="dxa"/>
-              <w:bottom w:w="100" w:type="dxa"/>
-              <w:left w:w="160" w:type="dxa"/>
-              <w:right w:w="160" w:type="dxa"/>
+              <w:top w:w="50" w:type="dxa"/>
+              <w:bottom w:w="50" w:type="dxa"/>
+              <w:left w:w="100" w:type="dxa"/>
+              <w:right w:w="100" w:type="dxa"/>
             </w:tcMar>
           </w:tcPr>
           <w:p>
             <w:pPr>
-              <w:spacing w:before="0" w:after="0" w:line="276" w:lineRule="auto"/>
+              <w:spacing w:before="0" w:after="0" w:line="264" w:lineRule="auto"/>
               <w:jc w:val="center"/>
             </w:pPr>
             <w:r>
               <w:rPr>
-                <w:sz w:val="19"/>
+                <w:sz w:val="17"/>
               </w:rPr>
               <w:t>#1053</w:t>
             </w:r>
@@ -1155,23 +1499,23 @@
         </w:tc>
         <w:tc>
           <w:tcPr>
-            <w:tcW w:type="dxa" w:w="4824"/>
+            <w:tcW w:type="dxa" w:w="5256"/>
             <w:shd w:fill="F2F5F9"/>
             <w:vAlign w:val="center"/>
             <w:tcMar>
-              <w:top w:w="100" w:type="dxa"/>
-              <w:bottom w:w="100" w:type="dxa"/>
-              <w:left w:w="160" w:type="dxa"/>
-              <w:right w:w="160" w:type="dxa"/>
+              <w:top w:w="50" w:type="dxa"/>
+              <w:bottom w:w="50" w:type="dxa"/>
+              <w:left w:w="100" w:type="dxa"/>
+              <w:right w:w="100" w:type="dxa"/>
             </w:tcMar>
           </w:tcPr>
           <w:p>
             <w:pPr>
-              <w:spacing w:before="0" w:after="0" w:line="276" w:lineRule="auto"/>
+              <w:spacing w:before="0" w:after="0" w:line="264" w:lineRule="auto"/>
             </w:pPr>
             <w:r>
               <w:rPr>
-                <w:sz w:val="19"/>
+                <w:sz w:val="17"/>
               </w:rPr>
               <w:t>Restricción HTTP 403 / redirección para usuario sin rol Administrador</w:t>
             </w:r>
@@ -1183,19 +1527,19 @@
             <w:shd w:fill="F2F5F9"/>
             <w:vAlign w:val="center"/>
             <w:tcMar>
-              <w:top w:w="100" w:type="dxa"/>
-              <w:bottom w:w="100" w:type="dxa"/>
-              <w:left w:w="160" w:type="dxa"/>
-              <w:right w:w="160" w:type="dxa"/>
+              <w:top w:w="50" w:type="dxa"/>
+              <w:bottom w:w="50" w:type="dxa"/>
+              <w:left w:w="100" w:type="dxa"/>
+              <w:right w:w="100" w:type="dxa"/>
             </w:tcMar>
           </w:tcPr>
           <w:p>
             <w:pPr>
-              <w:spacing w:before="0" w:after="0" w:line="276" w:lineRule="auto"/>
+              <w:spacing w:before="0" w:after="0" w:line="264" w:lineRule="auto"/>
             </w:pPr>
             <w:r>
               <w:rPr>
-                <w:sz w:val="19"/>
+                <w:sz w:val="17"/>
               </w:rPr>
               <w:t>Carlos Miranda</w:t>
             </w:r>
@@ -1203,11 +1547,6 @@
         </w:tc>
       </w:tr>
     </w:tbl>
-    <w:p>
-      <w:pPr>
-        <w:spacing w:after="80"/>
-      </w:pPr>
-    </w:p>
     <w:p>
       <w:r>
         <w:br w:type="page"/>
@@ -1237,24 +1576,24 @@
         <w:tblLook w:firstColumn="1" w:firstRow="1" w:lastColumn="0" w:lastRow="0" w:noHBand="0" w:noVBand="1" w:val="04A0"/>
       </w:tblPr>
       <w:tblGrid>
-        <w:gridCol w:w="4680"/>
-        <w:gridCol w:w="4680"/>
+        <w:gridCol w:w="4824"/>
+        <w:gridCol w:w="4824"/>
       </w:tblGrid>
       <w:tr>
         <w:trPr>
-          <w:trHeight w:val="380" w:hRule="atLeast"/>
+          <w:trHeight w:val="360" w:hRule="atLeast"/>
           <w:cantSplit/>
         </w:trPr>
         <w:tc>
           <w:tcPr>
-            <w:tcW w:type="dxa" w:w="6768"/>
+            <w:tcW w:type="dxa" w:w="6912"/>
             <w:shd w:fill="F2F5F9"/>
             <w:vAlign w:val="center"/>
             <w:tcMar>
-              <w:top w:w="80" w:type="dxa"/>
-              <w:bottom w:w="80" w:type="dxa"/>
-              <w:left w:w="200" w:type="dxa"/>
-              <w:right w:w="200" w:type="dxa"/>
+              <w:top w:w="70" w:type="dxa"/>
+              <w:bottom w:w="70" w:type="dxa"/>
+              <w:left w:w="160" w:type="dxa"/>
+              <w:right w:w="160" w:type="dxa"/>
             </w:tcMar>
           </w:tcPr>
           <w:p>
@@ -1264,7 +1603,7 @@
             <w:r>
               <w:rPr>
                 <w:b/>
-                <w:sz w:val="20"/>
+                <w:sz w:val="19"/>
               </w:rPr>
               <w:t>Número de pruebas declaradas:</w:t>
             </w:r>
@@ -1272,14 +1611,14 @@
         </w:tc>
         <w:tc>
           <w:tcPr>
-            <w:tcW w:type="dxa" w:w="2592"/>
+            <w:tcW w:type="dxa" w:w="2736"/>
             <w:shd w:fill="FFFFFF"/>
             <w:vAlign w:val="center"/>
             <w:tcMar>
-              <w:top w:w="80" w:type="dxa"/>
-              <w:bottom w:w="80" w:type="dxa"/>
-              <w:left w:w="200" w:type="dxa"/>
-              <w:right w:w="200" w:type="dxa"/>
+              <w:top w:w="70" w:type="dxa"/>
+              <w:bottom w:w="70" w:type="dxa"/>
+              <w:left w:w="160" w:type="dxa"/>
+              <w:right w:w="160" w:type="dxa"/>
             </w:tcMar>
           </w:tcPr>
           <w:p>
@@ -1290,7 +1629,7 @@
             <w:r>
               <w:rPr>
                 <w:b/>
-                <w:sz w:val="21"/>
+                <w:sz w:val="20"/>
               </w:rPr>
               <w:t>8</w:t>
             </w:r>
@@ -1299,19 +1638,19 @@
       </w:tr>
       <w:tr>
         <w:trPr>
-          <w:trHeight w:val="380" w:hRule="atLeast"/>
+          <w:trHeight w:val="360" w:hRule="atLeast"/>
           <w:cantSplit/>
         </w:trPr>
         <w:tc>
           <w:tcPr>
-            <w:tcW w:type="dxa" w:w="6768"/>
+            <w:tcW w:type="dxa" w:w="6912"/>
             <w:shd w:fill="F2F5F9"/>
             <w:vAlign w:val="center"/>
             <w:tcMar>
-              <w:top w:w="80" w:type="dxa"/>
-              <w:bottom w:w="80" w:type="dxa"/>
-              <w:left w:w="200" w:type="dxa"/>
-              <w:right w:w="200" w:type="dxa"/>
+              <w:top w:w="70" w:type="dxa"/>
+              <w:bottom w:w="70" w:type="dxa"/>
+              <w:left w:w="160" w:type="dxa"/>
+              <w:right w:w="160" w:type="dxa"/>
             </w:tcMar>
           </w:tcPr>
           <w:p>
@@ -1321,7 +1660,7 @@
             <w:r>
               <w:rPr>
                 <w:b/>
-                <w:sz w:val="20"/>
+                <w:sz w:val="19"/>
               </w:rPr>
               <w:t>Número de pruebas ejecutadas:</w:t>
             </w:r>
@@ -1329,14 +1668,14 @@
         </w:tc>
         <w:tc>
           <w:tcPr>
-            <w:tcW w:type="dxa" w:w="2592"/>
+            <w:tcW w:type="dxa" w:w="2736"/>
             <w:shd w:fill="FFFFFF"/>
             <w:vAlign w:val="center"/>
             <w:tcMar>
-              <w:top w:w="80" w:type="dxa"/>
-              <w:bottom w:w="80" w:type="dxa"/>
-              <w:left w:w="200" w:type="dxa"/>
-              <w:right w:w="200" w:type="dxa"/>
+              <w:top w:w="70" w:type="dxa"/>
+              <w:bottom w:w="70" w:type="dxa"/>
+              <w:left w:w="160" w:type="dxa"/>
+              <w:right w:w="160" w:type="dxa"/>
             </w:tcMar>
           </w:tcPr>
           <w:p>
@@ -1347,7 +1686,7 @@
             <w:r>
               <w:rPr>
                 <w:b/>
-                <w:sz w:val="21"/>
+                <w:sz w:val="20"/>
               </w:rPr>
               <w:t>8</w:t>
             </w:r>
@@ -1356,19 +1695,19 @@
       </w:tr>
       <w:tr>
         <w:trPr>
-          <w:trHeight w:val="380" w:hRule="atLeast"/>
+          <w:trHeight w:val="360" w:hRule="atLeast"/>
           <w:cantSplit/>
         </w:trPr>
         <w:tc>
           <w:tcPr>
-            <w:tcW w:type="dxa" w:w="6768"/>
+            <w:tcW w:type="dxa" w:w="6912"/>
             <w:shd w:fill="F2F5F9"/>
             <w:vAlign w:val="center"/>
             <w:tcMar>
-              <w:top w:w="80" w:type="dxa"/>
-              <w:bottom w:w="80" w:type="dxa"/>
-              <w:left w:w="200" w:type="dxa"/>
-              <w:right w:w="200" w:type="dxa"/>
+              <w:top w:w="70" w:type="dxa"/>
+              <w:bottom w:w="70" w:type="dxa"/>
+              <w:left w:w="160" w:type="dxa"/>
+              <w:right w:w="160" w:type="dxa"/>
             </w:tcMar>
           </w:tcPr>
           <w:p>
@@ -1378,7 +1717,7 @@
             <w:r>
               <w:rPr>
                 <w:b/>
-                <w:sz w:val="20"/>
+                <w:sz w:val="19"/>
               </w:rPr>
               <w:t>Número de pruebas exitosas:</w:t>
             </w:r>
@@ -1386,14 +1725,14 @@
         </w:tc>
         <w:tc>
           <w:tcPr>
-            <w:tcW w:type="dxa" w:w="2592"/>
+            <w:tcW w:type="dxa" w:w="2736"/>
             <w:shd w:fill="FFFFFF"/>
             <w:vAlign w:val="center"/>
             <w:tcMar>
-              <w:top w:w="80" w:type="dxa"/>
-              <w:bottom w:w="80" w:type="dxa"/>
-              <w:left w:w="200" w:type="dxa"/>
-              <w:right w:w="200" w:type="dxa"/>
+              <w:top w:w="70" w:type="dxa"/>
+              <w:bottom w:w="70" w:type="dxa"/>
+              <w:left w:w="160" w:type="dxa"/>
+              <w:right w:w="160" w:type="dxa"/>
             </w:tcMar>
           </w:tcPr>
           <w:p>
@@ -1404,7 +1743,7 @@
             <w:r>
               <w:rPr>
                 <w:b/>
-                <w:sz w:val="21"/>
+                <w:sz w:val="20"/>
               </w:rPr>
               <w:t>8</w:t>
             </w:r>
@@ -1413,19 +1752,19 @@
       </w:tr>
       <w:tr>
         <w:trPr>
-          <w:trHeight w:val="380" w:hRule="atLeast"/>
+          <w:trHeight w:val="360" w:hRule="atLeast"/>
           <w:cantSplit/>
         </w:trPr>
         <w:tc>
           <w:tcPr>
-            <w:tcW w:type="dxa" w:w="6768"/>
+            <w:tcW w:type="dxa" w:w="6912"/>
             <w:shd w:fill="F2F5F9"/>
             <w:vAlign w:val="center"/>
             <w:tcMar>
-              <w:top w:w="80" w:type="dxa"/>
-              <w:bottom w:w="80" w:type="dxa"/>
-              <w:left w:w="200" w:type="dxa"/>
-              <w:right w:w="200" w:type="dxa"/>
+              <w:top w:w="70" w:type="dxa"/>
+              <w:bottom w:w="70" w:type="dxa"/>
+              <w:left w:w="160" w:type="dxa"/>
+              <w:right w:w="160" w:type="dxa"/>
             </w:tcMar>
           </w:tcPr>
           <w:p>
@@ -1435,7 +1774,7 @@
             <w:r>
               <w:rPr>
                 <w:b/>
-                <w:sz w:val="20"/>
+                <w:sz w:val="19"/>
               </w:rPr>
               <w:t>Número de pruebas pendientes (fallidas):</w:t>
             </w:r>
@@ -1443,14 +1782,14 @@
         </w:tc>
         <w:tc>
           <w:tcPr>
-            <w:tcW w:type="dxa" w:w="2592"/>
+            <w:tcW w:type="dxa" w:w="2736"/>
             <w:shd w:fill="FFFFFF"/>
             <w:vAlign w:val="center"/>
             <w:tcMar>
-              <w:top w:w="80" w:type="dxa"/>
-              <w:bottom w:w="80" w:type="dxa"/>
-              <w:left w:w="200" w:type="dxa"/>
-              <w:right w:w="200" w:type="dxa"/>
+              <w:top w:w="70" w:type="dxa"/>
+              <w:bottom w:w="70" w:type="dxa"/>
+              <w:left w:w="160" w:type="dxa"/>
+              <w:right w:w="160" w:type="dxa"/>
             </w:tcMar>
           </w:tcPr>
           <w:p>
@@ -1461,7 +1800,7 @@
             <w:r>
               <w:rPr>
                 <w:b/>
-                <w:sz w:val="21"/>
+                <w:sz w:val="20"/>
               </w:rPr>
               <w:t>0</w:t>
             </w:r>
@@ -1471,12 +1810,12 @@
     </w:tbl>
     <w:p>
       <w:pPr>
-        <w:spacing w:after="80"/>
+        <w:spacing w:after="60"/>
       </w:pPr>
     </w:p>
     <w:p>
       <w:pPr>
-        <w:spacing w:after="80" w:line="276" w:lineRule="auto"/>
+        <w:spacing w:before="0" w:after="70" w:line="276" w:lineRule="auto"/>
       </w:pPr>
       <w:r>
         <w:rPr>
@@ -1529,7 +1868,7 @@
     </w:p>
     <w:p>
       <w:pPr>
-        <w:spacing w:after="160" w:line="276" w:lineRule="auto"/>
+        <w:spacing w:before="0" w:after="120" w:line="276" w:lineRule="auto"/>
         <w:jc w:val="center"/>
       </w:pPr>
       <w:r>
@@ -1537,7 +1876,7 @@
           <w:b w:val="0"/>
           <w:i/>
           <w:color w:val="595959"/>
-          <w:sz w:val="18"/>
+          <w:sz w:val="17"/>
         </w:rPr>
         <w:t>Evidencia 1. Seguimiento de las pruebas de aceptación en la plantilla de casos de prueba (8 de 8 exitosas).</w:t>
       </w:r>
@@ -1590,7 +1929,7 @@
     </w:p>
     <w:p>
       <w:pPr>
-        <w:spacing w:after="160" w:line="276" w:lineRule="auto"/>
+        <w:spacing w:before="0" w:after="120" w:line="276" w:lineRule="auto"/>
         <w:jc w:val="center"/>
       </w:pPr>
       <w:r>
@@ -1598,7 +1937,7 @@
           <w:b w:val="0"/>
           <w:i/>
           <w:color w:val="595959"/>
-          <w:sz w:val="18"/>
+          <w:sz w:val="17"/>
         </w:rPr>
         <w:t>Evidencia 2. Test Suite #1055 en Azure Test Plans con los 8 casos de aceptación.</w:t>
       </w:r>
@@ -1646,7 +1985,7 @@
     </w:p>
     <w:p>
       <w:pPr>
-        <w:spacing w:after="160" w:line="276" w:lineRule="auto"/>
+        <w:spacing w:before="0" w:after="120" w:line="276" w:lineRule="auto"/>
         <w:jc w:val="center"/>
       </w:pPr>
       <w:r>
@@ -1654,7 +1993,7 @@
           <w:b w:val="0"/>
           <w:i/>
           <w:color w:val="595959"/>
-          <w:sz w:val="18"/>
+          <w:sz w:val="17"/>
         </w:rPr>
         <w:t>Evidencia 3. Progress Report de Azure Test Plans (8 de 8 puntos de prueba ejecutados, 100 % aprobados).</w:t>
       </w:r>
@@ -1680,24 +2019,24 @@
         <w:tblLook w:firstColumn="1" w:firstRow="1" w:lastColumn="0" w:lastRow="0" w:noHBand="0" w:noVBand="1" w:val="04A0"/>
       </w:tblPr>
       <w:tblGrid>
-        <w:gridCol w:w="4680"/>
-        <w:gridCol w:w="4680"/>
+        <w:gridCol w:w="4824"/>
+        <w:gridCol w:w="4824"/>
       </w:tblGrid>
       <w:tr>
         <w:trPr>
-          <w:trHeight w:val="380" w:hRule="atLeast"/>
+          <w:trHeight w:val="360" w:hRule="atLeast"/>
           <w:cantSplit/>
         </w:trPr>
         <w:tc>
           <w:tcPr>
-            <w:tcW w:type="dxa" w:w="6768"/>
+            <w:tcW w:type="dxa" w:w="6912"/>
             <w:shd w:fill="F2F5F9"/>
             <w:vAlign w:val="center"/>
             <w:tcMar>
-              <w:top w:w="80" w:type="dxa"/>
-              <w:bottom w:w="80" w:type="dxa"/>
-              <w:left w:w="200" w:type="dxa"/>
-              <w:right w:w="200" w:type="dxa"/>
+              <w:top w:w="70" w:type="dxa"/>
+              <w:bottom w:w="70" w:type="dxa"/>
+              <w:left w:w="160" w:type="dxa"/>
+              <w:right w:w="160" w:type="dxa"/>
             </w:tcMar>
           </w:tcPr>
           <w:p>
@@ -1707,7 +2046,7 @@
             <w:r>
               <w:rPr>
                 <w:b/>
-                <w:sz w:val="20"/>
+                <w:sz w:val="19"/>
               </w:rPr>
               <w:t>Número de pruebas declaradas:</w:t>
             </w:r>
@@ -1715,14 +2054,14 @@
         </w:tc>
         <w:tc>
           <w:tcPr>
-            <w:tcW w:type="dxa" w:w="2592"/>
+            <w:tcW w:type="dxa" w:w="2736"/>
             <w:shd w:fill="FFFFFF"/>
             <w:vAlign w:val="center"/>
             <w:tcMar>
-              <w:top w:w="80" w:type="dxa"/>
-              <w:bottom w:w="80" w:type="dxa"/>
-              <w:left w:w="200" w:type="dxa"/>
-              <w:right w:w="200" w:type="dxa"/>
+              <w:top w:w="70" w:type="dxa"/>
+              <w:bottom w:w="70" w:type="dxa"/>
+              <w:left w:w="160" w:type="dxa"/>
+              <w:right w:w="160" w:type="dxa"/>
             </w:tcMar>
           </w:tcPr>
           <w:p>
@@ -1733,7 +2072,7 @@
             <w:r>
               <w:rPr>
                 <w:b/>
-                <w:sz w:val="21"/>
+                <w:sz w:val="20"/>
               </w:rPr>
               <w:t>16</w:t>
             </w:r>
@@ -1742,19 +2081,19 @@
       </w:tr>
       <w:tr>
         <w:trPr>
-          <w:trHeight w:val="380" w:hRule="atLeast"/>
+          <w:trHeight w:val="360" w:hRule="atLeast"/>
           <w:cantSplit/>
         </w:trPr>
         <w:tc>
           <w:tcPr>
-            <w:tcW w:type="dxa" w:w="6768"/>
+            <w:tcW w:type="dxa" w:w="6912"/>
             <w:shd w:fill="F2F5F9"/>
             <w:vAlign w:val="center"/>
             <w:tcMar>
-              <w:top w:w="80" w:type="dxa"/>
-              <w:bottom w:w="80" w:type="dxa"/>
-              <w:left w:w="200" w:type="dxa"/>
-              <w:right w:w="200" w:type="dxa"/>
+              <w:top w:w="70" w:type="dxa"/>
+              <w:bottom w:w="70" w:type="dxa"/>
+              <w:left w:w="160" w:type="dxa"/>
+              <w:right w:w="160" w:type="dxa"/>
             </w:tcMar>
           </w:tcPr>
           <w:p>
@@ -1764,7 +2103,7 @@
             <w:r>
               <w:rPr>
                 <w:b/>
-                <w:sz w:val="20"/>
+                <w:sz w:val="19"/>
               </w:rPr>
               <w:t>Número de pruebas ejecutadas:</w:t>
             </w:r>
@@ -1772,14 +2111,14 @@
         </w:tc>
         <w:tc>
           <w:tcPr>
-            <w:tcW w:type="dxa" w:w="2592"/>
+            <w:tcW w:type="dxa" w:w="2736"/>
             <w:shd w:fill="FFFFFF"/>
             <w:vAlign w:val="center"/>
             <w:tcMar>
-              <w:top w:w="80" w:type="dxa"/>
-              <w:bottom w:w="80" w:type="dxa"/>
-              <w:left w:w="200" w:type="dxa"/>
-              <w:right w:w="200" w:type="dxa"/>
+              <w:top w:w="70" w:type="dxa"/>
+              <w:bottom w:w="70" w:type="dxa"/>
+              <w:left w:w="160" w:type="dxa"/>
+              <w:right w:w="160" w:type="dxa"/>
             </w:tcMar>
           </w:tcPr>
           <w:p>
@@ -1790,7 +2129,7 @@
             <w:r>
               <w:rPr>
                 <w:b/>
-                <w:sz w:val="21"/>
+                <w:sz w:val="20"/>
               </w:rPr>
               <w:t>16</w:t>
             </w:r>
@@ -1799,19 +2138,19 @@
       </w:tr>
       <w:tr>
         <w:trPr>
-          <w:trHeight w:val="380" w:hRule="atLeast"/>
+          <w:trHeight w:val="360" w:hRule="atLeast"/>
           <w:cantSplit/>
         </w:trPr>
         <w:tc>
           <w:tcPr>
-            <w:tcW w:type="dxa" w:w="6768"/>
+            <w:tcW w:type="dxa" w:w="6912"/>
             <w:shd w:fill="F2F5F9"/>
             <w:vAlign w:val="center"/>
             <w:tcMar>
-              <w:top w:w="80" w:type="dxa"/>
-              <w:bottom w:w="80" w:type="dxa"/>
-              <w:left w:w="200" w:type="dxa"/>
-              <w:right w:w="200" w:type="dxa"/>
+              <w:top w:w="70" w:type="dxa"/>
+              <w:bottom w:w="70" w:type="dxa"/>
+              <w:left w:w="160" w:type="dxa"/>
+              <w:right w:w="160" w:type="dxa"/>
             </w:tcMar>
           </w:tcPr>
           <w:p>
@@ -1821,7 +2160,7 @@
             <w:r>
               <w:rPr>
                 <w:b/>
-                <w:sz w:val="20"/>
+                <w:sz w:val="19"/>
               </w:rPr>
               <w:t>Número de pruebas exitosas:</w:t>
             </w:r>
@@ -1829,14 +2168,14 @@
         </w:tc>
         <w:tc>
           <w:tcPr>
-            <w:tcW w:type="dxa" w:w="2592"/>
+            <w:tcW w:type="dxa" w:w="2736"/>
             <w:shd w:fill="FFFFFF"/>
             <w:vAlign w:val="center"/>
             <w:tcMar>
-              <w:top w:w="80" w:type="dxa"/>
-              <w:bottom w:w="80" w:type="dxa"/>
-              <w:left w:w="200" w:type="dxa"/>
-              <w:right w:w="200" w:type="dxa"/>
+              <w:top w:w="70" w:type="dxa"/>
+              <w:bottom w:w="70" w:type="dxa"/>
+              <w:left w:w="160" w:type="dxa"/>
+              <w:right w:w="160" w:type="dxa"/>
             </w:tcMar>
           </w:tcPr>
           <w:p>
@@ -1847,7 +2186,7 @@
             <w:r>
               <w:rPr>
                 <w:b/>
-                <w:sz w:val="21"/>
+                <w:sz w:val="20"/>
               </w:rPr>
               <w:t>16</w:t>
             </w:r>
@@ -1856,19 +2195,19 @@
       </w:tr>
       <w:tr>
         <w:trPr>
-          <w:trHeight w:val="380" w:hRule="atLeast"/>
+          <w:trHeight w:val="360" w:hRule="atLeast"/>
           <w:cantSplit/>
         </w:trPr>
         <w:tc>
           <w:tcPr>
-            <w:tcW w:type="dxa" w:w="6768"/>
+            <w:tcW w:type="dxa" w:w="6912"/>
             <w:shd w:fill="F2F5F9"/>
             <w:vAlign w:val="center"/>
             <w:tcMar>
-              <w:top w:w="80" w:type="dxa"/>
-              <w:bottom w:w="80" w:type="dxa"/>
-              <w:left w:w="200" w:type="dxa"/>
-              <w:right w:w="200" w:type="dxa"/>
+              <w:top w:w="70" w:type="dxa"/>
+              <w:bottom w:w="70" w:type="dxa"/>
+              <w:left w:w="160" w:type="dxa"/>
+              <w:right w:w="160" w:type="dxa"/>
             </w:tcMar>
           </w:tcPr>
           <w:p>
@@ -1878,7 +2217,7 @@
             <w:r>
               <w:rPr>
                 <w:b/>
-                <w:sz w:val="20"/>
+                <w:sz w:val="19"/>
               </w:rPr>
               <w:t>Número de pruebas pendientes (fallidas):</w:t>
             </w:r>
@@ -1886,14 +2225,14 @@
         </w:tc>
         <w:tc>
           <w:tcPr>
-            <w:tcW w:type="dxa" w:w="2592"/>
+            <w:tcW w:type="dxa" w:w="2736"/>
             <w:shd w:fill="FFFFFF"/>
             <w:vAlign w:val="center"/>
             <w:tcMar>
-              <w:top w:w="80" w:type="dxa"/>
-              <w:bottom w:w="80" w:type="dxa"/>
-              <w:left w:w="200" w:type="dxa"/>
-              <w:right w:w="200" w:type="dxa"/>
+              <w:top w:w="70" w:type="dxa"/>
+              <w:bottom w:w="70" w:type="dxa"/>
+              <w:left w:w="160" w:type="dxa"/>
+              <w:right w:w="160" w:type="dxa"/>
             </w:tcMar>
           </w:tcPr>
           <w:p>
@@ -1904,7 +2243,7 @@
             <w:r>
               <w:rPr>
                 <w:b/>
-                <w:sz w:val="21"/>
+                <w:sz w:val="20"/>
               </w:rPr>
               <w:t>0</w:t>
             </w:r>
@@ -1914,12 +2253,12 @@
     </w:tbl>
     <w:p>
       <w:pPr>
-        <w:spacing w:after="80"/>
+        <w:spacing w:after="60"/>
       </w:pPr>
     </w:p>
     <w:p>
       <w:pPr>
-        <w:spacing w:after="80" w:line="276" w:lineRule="auto"/>
+        <w:spacing w:before="0" w:after="70" w:line="276" w:lineRule="auto"/>
       </w:pPr>
       <w:r>
         <w:rPr>
@@ -1972,7 +2311,7 @@
     </w:p>
     <w:p>
       <w:pPr>
-        <w:spacing w:after="160" w:line="276" w:lineRule="auto"/>
+        <w:spacing w:before="0" w:after="120" w:line="276" w:lineRule="auto"/>
         <w:jc w:val="center"/>
       </w:pPr>
       <w:r>
@@ -1980,7 +2319,7 @@
           <w:b w:val="0"/>
           <w:i/>
           <w:color w:val="595959"/>
-          <w:sz w:val="18"/>
+          <w:sz w:val="17"/>
         </w:rPr>
         <w:t>Evidencia 4. Seguimiento de las pruebas de API en la plantilla de casos de prueba (16 de 16 exitosas).</w:t>
       </w:r>
@@ -2006,24 +2345,24 @@
         <w:tblLook w:firstColumn="1" w:firstRow="1" w:lastColumn="0" w:lastRow="0" w:noHBand="0" w:noVBand="1" w:val="04A0"/>
       </w:tblPr>
       <w:tblGrid>
-        <w:gridCol w:w="4680"/>
-        <w:gridCol w:w="4680"/>
+        <w:gridCol w:w="4824"/>
+        <w:gridCol w:w="4824"/>
       </w:tblGrid>
       <w:tr>
         <w:trPr>
-          <w:trHeight w:val="380" w:hRule="atLeast"/>
+          <w:trHeight w:val="360" w:hRule="atLeast"/>
           <w:cantSplit/>
         </w:trPr>
         <w:tc>
           <w:tcPr>
-            <w:tcW w:type="dxa" w:w="6768"/>
+            <w:tcW w:type="dxa" w:w="6912"/>
             <w:shd w:fill="F2F5F9"/>
             <w:vAlign w:val="center"/>
             <w:tcMar>
-              <w:top w:w="80" w:type="dxa"/>
-              <w:bottom w:w="80" w:type="dxa"/>
-              <w:left w:w="200" w:type="dxa"/>
-              <w:right w:w="200" w:type="dxa"/>
+              <w:top w:w="70" w:type="dxa"/>
+              <w:bottom w:w="70" w:type="dxa"/>
+              <w:left w:w="160" w:type="dxa"/>
+              <w:right w:w="160" w:type="dxa"/>
             </w:tcMar>
           </w:tcPr>
           <w:p>
@@ -2033,7 +2372,7 @@
             <w:r>
               <w:rPr>
                 <w:b/>
-                <w:sz w:val="20"/>
+                <w:sz w:val="19"/>
               </w:rPr>
               <w:t>Número de pruebas declaradas:</w:t>
             </w:r>
@@ -2041,14 +2380,14 @@
         </w:tc>
         <w:tc>
           <w:tcPr>
-            <w:tcW w:type="dxa" w:w="2592"/>
+            <w:tcW w:type="dxa" w:w="2736"/>
             <w:shd w:fill="FFFFFF"/>
             <w:vAlign w:val="center"/>
             <w:tcMar>
-              <w:top w:w="80" w:type="dxa"/>
-              <w:bottom w:w="80" w:type="dxa"/>
-              <w:left w:w="200" w:type="dxa"/>
-              <w:right w:w="200" w:type="dxa"/>
+              <w:top w:w="70" w:type="dxa"/>
+              <w:bottom w:w="70" w:type="dxa"/>
+              <w:left w:w="160" w:type="dxa"/>
+              <w:right w:w="160" w:type="dxa"/>
             </w:tcMar>
           </w:tcPr>
           <w:p>
@@ -2059,7 +2398,7 @@
             <w:r>
               <w:rPr>
                 <w:b/>
-                <w:sz w:val="21"/>
+                <w:sz w:val="20"/>
               </w:rPr>
               <w:t>21</w:t>
             </w:r>
@@ -2068,19 +2407,19 @@
       </w:tr>
       <w:tr>
         <w:trPr>
-          <w:trHeight w:val="380" w:hRule="atLeast"/>
+          <w:trHeight w:val="360" w:hRule="atLeast"/>
           <w:cantSplit/>
         </w:trPr>
         <w:tc>
           <w:tcPr>
-            <w:tcW w:type="dxa" w:w="6768"/>
+            <w:tcW w:type="dxa" w:w="6912"/>
             <w:shd w:fill="F2F5F9"/>
             <w:vAlign w:val="center"/>
             <w:tcMar>
-              <w:top w:w="80" w:type="dxa"/>
-              <w:bottom w:w="80" w:type="dxa"/>
-              <w:left w:w="200" w:type="dxa"/>
-              <w:right w:w="200" w:type="dxa"/>
+              <w:top w:w="70" w:type="dxa"/>
+              <w:bottom w:w="70" w:type="dxa"/>
+              <w:left w:w="160" w:type="dxa"/>
+              <w:right w:w="160" w:type="dxa"/>
             </w:tcMar>
           </w:tcPr>
           <w:p>
@@ -2090,7 +2429,7 @@
             <w:r>
               <w:rPr>
                 <w:b/>
-                <w:sz w:val="20"/>
+                <w:sz w:val="19"/>
               </w:rPr>
               <w:t>Número de pruebas ejecutadas:</w:t>
             </w:r>
@@ -2098,14 +2437,14 @@
         </w:tc>
         <w:tc>
           <w:tcPr>
-            <w:tcW w:type="dxa" w:w="2592"/>
+            <w:tcW w:type="dxa" w:w="2736"/>
             <w:shd w:fill="FFFFFF"/>
             <w:vAlign w:val="center"/>
             <w:tcMar>
-              <w:top w:w="80" w:type="dxa"/>
-              <w:bottom w:w="80" w:type="dxa"/>
-              <w:left w:w="200" w:type="dxa"/>
-              <w:right w:w="200" w:type="dxa"/>
+              <w:top w:w="70" w:type="dxa"/>
+              <w:bottom w:w="70" w:type="dxa"/>
+              <w:left w:w="160" w:type="dxa"/>
+              <w:right w:w="160" w:type="dxa"/>
             </w:tcMar>
           </w:tcPr>
           <w:p>
@@ -2116,7 +2455,7 @@
             <w:r>
               <w:rPr>
                 <w:b/>
-                <w:sz w:val="21"/>
+                <w:sz w:val="20"/>
               </w:rPr>
               <w:t>21</w:t>
             </w:r>
@@ -2125,19 +2464,19 @@
       </w:tr>
       <w:tr>
         <w:trPr>
-          <w:trHeight w:val="380" w:hRule="atLeast"/>
+          <w:trHeight w:val="360" w:hRule="atLeast"/>
           <w:cantSplit/>
         </w:trPr>
         <w:tc>
           <w:tcPr>
-            <w:tcW w:type="dxa" w:w="6768"/>
+            <w:tcW w:type="dxa" w:w="6912"/>
             <w:shd w:fill="F2F5F9"/>
             <w:vAlign w:val="center"/>
             <w:tcMar>
-              <w:top w:w="80" w:type="dxa"/>
-              <w:bottom w:w="80" w:type="dxa"/>
-              <w:left w:w="200" w:type="dxa"/>
-              <w:right w:w="200" w:type="dxa"/>
+              <w:top w:w="70" w:type="dxa"/>
+              <w:bottom w:w="70" w:type="dxa"/>
+              <w:left w:w="160" w:type="dxa"/>
+              <w:right w:w="160" w:type="dxa"/>
             </w:tcMar>
           </w:tcPr>
           <w:p>
@@ -2147,7 +2486,7 @@
             <w:r>
               <w:rPr>
                 <w:b/>
-                <w:sz w:val="20"/>
+                <w:sz w:val="19"/>
               </w:rPr>
               <w:t>Número de pruebas exitosas:</w:t>
             </w:r>
@@ -2155,14 +2494,14 @@
         </w:tc>
         <w:tc>
           <w:tcPr>
-            <w:tcW w:type="dxa" w:w="2592"/>
+            <w:tcW w:type="dxa" w:w="2736"/>
             <w:shd w:fill="FFFFFF"/>
             <w:vAlign w:val="center"/>
             <w:tcMar>
-              <w:top w:w="80" w:type="dxa"/>
-              <w:bottom w:w="80" w:type="dxa"/>
-              <w:left w:w="200" w:type="dxa"/>
-              <w:right w:w="200" w:type="dxa"/>
+              <w:top w:w="70" w:type="dxa"/>
+              <w:bottom w:w="70" w:type="dxa"/>
+              <w:left w:w="160" w:type="dxa"/>
+              <w:right w:w="160" w:type="dxa"/>
             </w:tcMar>
           </w:tcPr>
           <w:p>
@@ -2173,7 +2512,7 @@
             <w:r>
               <w:rPr>
                 <w:b/>
-                <w:sz w:val="21"/>
+                <w:sz w:val="20"/>
               </w:rPr>
               <w:t>21</w:t>
             </w:r>
@@ -2182,19 +2521,19 @@
       </w:tr>
       <w:tr>
         <w:trPr>
-          <w:trHeight w:val="380" w:hRule="atLeast"/>
+          <w:trHeight w:val="360" w:hRule="atLeast"/>
           <w:cantSplit/>
         </w:trPr>
         <w:tc>
           <w:tcPr>
-            <w:tcW w:type="dxa" w:w="6768"/>
+            <w:tcW w:type="dxa" w:w="6912"/>
             <w:shd w:fill="F2F5F9"/>
             <w:vAlign w:val="center"/>
             <w:tcMar>
-              <w:top w:w="80" w:type="dxa"/>
-              <w:bottom w:w="80" w:type="dxa"/>
-              <w:left w:w="200" w:type="dxa"/>
-              <w:right w:w="200" w:type="dxa"/>
+              <w:top w:w="70" w:type="dxa"/>
+              <w:bottom w:w="70" w:type="dxa"/>
+              <w:left w:w="160" w:type="dxa"/>
+              <w:right w:w="160" w:type="dxa"/>
             </w:tcMar>
           </w:tcPr>
           <w:p>
@@ -2204,7 +2543,7 @@
             <w:r>
               <w:rPr>
                 <w:b/>
-                <w:sz w:val="20"/>
+                <w:sz w:val="19"/>
               </w:rPr>
               <w:t>Número de pruebas pendientes (fallidas):</w:t>
             </w:r>
@@ -2212,14 +2551,14 @@
         </w:tc>
         <w:tc>
           <w:tcPr>
-            <w:tcW w:type="dxa" w:w="2592"/>
+            <w:tcW w:type="dxa" w:w="2736"/>
             <w:shd w:fill="FFFFFF"/>
             <w:vAlign w:val="center"/>
             <w:tcMar>
-              <w:top w:w="80" w:type="dxa"/>
-              <w:bottom w:w="80" w:type="dxa"/>
-              <w:left w:w="200" w:type="dxa"/>
-              <w:right w:w="200" w:type="dxa"/>
+              <w:top w:w="70" w:type="dxa"/>
+              <w:bottom w:w="70" w:type="dxa"/>
+              <w:left w:w="160" w:type="dxa"/>
+              <w:right w:w="160" w:type="dxa"/>
             </w:tcMar>
           </w:tcPr>
           <w:p>
@@ -2230,7 +2569,7 @@
             <w:r>
               <w:rPr>
                 <w:b/>
-                <w:sz w:val="21"/>
+                <w:sz w:val="20"/>
               </w:rPr>
               <w:t>0</w:t>
             </w:r>
@@ -2240,12 +2579,12 @@
     </w:tbl>
     <w:p>
       <w:pPr>
-        <w:spacing w:after="80"/>
+        <w:spacing w:after="60"/>
       </w:pPr>
     </w:p>
     <w:p>
       <w:pPr>
-        <w:spacing w:after="80" w:line="276" w:lineRule="auto"/>
+        <w:spacing w:before="0" w:after="70" w:line="276" w:lineRule="auto"/>
       </w:pPr>
       <w:r>
         <w:rPr>
@@ -2298,7 +2637,7 @@
     </w:p>
     <w:p>
       <w:pPr>
-        <w:spacing w:after="160" w:line="276" w:lineRule="auto"/>
+        <w:spacing w:before="0" w:after="120" w:line="276" w:lineRule="auto"/>
         <w:jc w:val="center"/>
       </w:pPr>
       <w:r>
@@ -2306,7 +2645,7 @@
           <w:b w:val="0"/>
           <w:i/>
           <w:color w:val="595959"/>
-          <w:sz w:val="18"/>
+          <w:sz w:val="17"/>
         </w:rPr>
         <w:t>Evidencia 5. Gráfico generado por Azure DevOps Pipelines (Build #18, pestaña Tests) confirmando la ejecución y aprobación del 100 % de las pruebas automatizadas (45 pruebas totales, 45 exitosas, 0 fallidas).</w:t>
       </w:r>
@@ -2359,7 +2698,7 @@
     </w:p>
     <w:p>
       <w:pPr>
-        <w:spacing w:after="160" w:line="276" w:lineRule="auto"/>
+        <w:spacing w:before="0" w:after="120" w:line="276" w:lineRule="auto"/>
         <w:jc w:val="center"/>
       </w:pPr>
       <w:r>
@@ -2367,7 +2706,7 @@
           <w:b w:val="0"/>
           <w:i/>
           <w:color w:val="595959"/>
-          <w:sz w:val="18"/>
+          <w:sz w:val="17"/>
         </w:rPr>
         <w:t>Evidencia 6. Seguimiento detallado de las 21 pruebas unitarias en la plantilla de casos de prueba (100 % exitosas).</w:t>
       </w:r>
@@ -2388,7 +2727,7 @@
     <w:p>
       <w:pPr>
         <w:pStyle w:val="ListBullet"/>
-        <w:spacing w:after="50" w:line="276" w:lineRule="auto"/>
+        <w:spacing w:before="0" w:after="30" w:line="276" w:lineRule="auto"/>
       </w:pPr>
       <w:r>
         <w:rPr>
@@ -2403,7 +2742,7 @@
     <w:p>
       <w:pPr>
         <w:pStyle w:val="ListBullet"/>
-        <w:spacing w:after="50" w:line="276" w:lineRule="auto"/>
+        <w:spacing w:before="0" w:after="30" w:line="276" w:lineRule="auto"/>
       </w:pPr>
       <w:r>
         <w:rPr>
@@ -2418,7 +2757,7 @@
     <w:p>
       <w:pPr>
         <w:pStyle w:val="ListBullet"/>
-        <w:spacing w:after="50" w:line="276" w:lineRule="auto"/>
+        <w:spacing w:before="0" w:after="30" w:line="276" w:lineRule="auto"/>
       </w:pPr>
       <w:r>
         <w:rPr>
@@ -2433,7 +2772,7 @@
     <w:p>
       <w:pPr>
         <w:pStyle w:val="ListBullet"/>
-        <w:spacing w:after="50" w:line="276" w:lineRule="auto"/>
+        <w:spacing w:before="0" w:after="30" w:line="276" w:lineRule="auto"/>
       </w:pPr>
       <w:r>
         <w:rPr>
@@ -2456,7 +2795,7 @@
     <w:p>
       <w:pPr>
         <w:pStyle w:val="ListBullet"/>
-        <w:spacing w:after="50" w:line="276" w:lineRule="auto"/>
+        <w:spacing w:before="0" w:after="30" w:line="276" w:lineRule="auto"/>
       </w:pPr>
       <w:r>
         <w:rPr>
@@ -2471,7 +2810,7 @@
     <w:p>
       <w:pPr>
         <w:pStyle w:val="ListBullet"/>
-        <w:spacing w:after="50" w:line="276" w:lineRule="auto"/>
+        <w:spacing w:before="0" w:after="30" w:line="276" w:lineRule="auto"/>
       </w:pPr>
       <w:r>
         <w:rPr>
@@ -2486,7 +2825,7 @@
     <w:p>
       <w:pPr>
         <w:pStyle w:val="ListBullet"/>
-        <w:spacing w:after="50" w:line="276" w:lineRule="auto"/>
+        <w:spacing w:before="0" w:after="30" w:line="276" w:lineRule="auto"/>
       </w:pPr>
       <w:r>
         <w:rPr>
@@ -2501,7 +2840,7 @@
     <w:p>
       <w:pPr>
         <w:pStyle w:val="ListBullet"/>
-        <w:spacing w:after="50" w:line="276" w:lineRule="auto"/>
+        <w:spacing w:before="0" w:after="30" w:line="276" w:lineRule="auto"/>
       </w:pPr>
       <w:r>
         <w:rPr>
@@ -2515,7 +2854,7 @@
     </w:p>
     <w:sectPr>
       <w:pgSz w:w="12240" w:h="15840"/>
-      <w:pgMar w:top="1440" w:right="1440" w:bottom="1440" w:left="1440" w:header="720" w:footer="720" w:gutter="0"/>
+      <w:pgMar w:top="1152" w:right="1296" w:bottom="1152" w:left="1296" w:header="720" w:footer="720" w:gutter="0"/>
       <w:cols w:space="720"/>
       <w:docGrid w:linePitch="360"/>
     </w:sectPr>
@@ -2888,7 +3227,7 @@
     <w:rsid w:val="00FC693F"/>
     <w:rPr>
       <w:rFonts w:ascii="Calibri" w:hAnsi="Calibri" w:eastAsia="Calibri"/>
-      <w:sz w:val="22"/>
+      <w:sz w:val="21"/>
     </w:rPr>
   </w:style>
   <w:style w:type="paragraph" w:styleId="Header">
@@ -2946,15 +3285,15 @@
     <w:pPr>
       <w:keepNext/>
       <w:keepLines/>
-      <w:spacing w:before="240" w:after="80"/>
+      <w:spacing w:before="160" w:after="60"/>
       <w:outlineLvl w:val="0"/>
     </w:pPr>
     <w:rPr>
-      <w:rFonts w:asciiTheme="majorHAnsi" w:eastAsiaTheme="majorEastAsia" w:hAnsiTheme="majorHAnsi" w:cstheme="majorBidi" w:ascii="Calibri" w:hAnsi="Calibri" w:eastAsia="Calibri"/>
+      <w:rFonts w:asciiTheme="majorHAnsi" w:eastAsiaTheme="majorEastAsia" w:hAnsiTheme="majorHAnsi" w:cstheme="majorBidi" w:ascii="Calibri" w:hAnsi="Calibri"/>
       <w:b/>
       <w:bCs/>
       <w:color w:val="1F3A5F"/>
-      <w:sz w:val="30"/>
+      <w:sz w:val="28"/>
       <w:szCs w:val="28"/>
     </w:rPr>
   </w:style>
@@ -2970,15 +3309,15 @@
     <w:pPr>
       <w:keepNext/>
       <w:keepLines/>
-      <w:spacing w:before="240" w:after="80"/>
+      <w:spacing w:before="120" w:after="40"/>
       <w:outlineLvl w:val="1"/>
     </w:pPr>
     <w:rPr>
-      <w:rFonts w:asciiTheme="majorHAnsi" w:eastAsiaTheme="majorEastAsia" w:hAnsiTheme="majorHAnsi" w:cstheme="majorBidi" w:ascii="Calibri" w:hAnsi="Calibri" w:eastAsia="Calibri"/>
+      <w:rFonts w:asciiTheme="majorHAnsi" w:eastAsiaTheme="majorEastAsia" w:hAnsiTheme="majorHAnsi" w:cstheme="majorBidi" w:ascii="Calibri" w:hAnsi="Calibri"/>
       <w:b/>
       <w:bCs/>
       <w:color w:val="1F3A5F"/>
-      <w:sz w:val="25"/>
+      <w:sz w:val="24"/>
       <w:szCs w:val="26"/>
     </w:rPr>
   </w:style>

</xml_diff>